<commit_message>
Refresh generated PR3 document
Co-authored-by: alexproxor <alexproxor@users.noreply.github.com>
</commit_message>
<xml_diff>
--- a/Прохоров.А.Ф_ПР3.docx
+++ b/Прохоров.А.Ф_ПР3.docx
@@ -4030,6 +4030,11 @@
     </w:p>
     <w:p>
       <w:r>
+        <w:br w:type="page"/>
+      </w:r>
+    </w:p>
+    <w:p>
+      <w:r>
         <w:rPr>
           <w:b/>
           <w:sz w:val="25"/>
@@ -5176,7 +5181,7 @@
               <a:graphicData uri="http://schemas.openxmlformats.org/drawingml/2006/picture">
                 <pic:pic>
                   <pic:nvPicPr>
-                    <pic:cNvPr id="0" name="pr3_network_graph.png"/>
+                    <pic:cNvPr id="0" name="image.png"/>
                     <pic:cNvPicPr/>
                   </pic:nvPicPr>
                   <pic:blipFill>

</xml_diff>

<commit_message>
Adjust task durations to allowed range
Co-authored-by: alexproxor <alexproxor@users.noreply.github.com>
</commit_message>
<xml_diff>
--- a/Прохоров.А.Ф_ПР3.docx
+++ b/Прохоров.А.Ф_ПР3.docx
@@ -2550,7 +2550,7 @@
           </w:tcPr>
           <w:p>
             <w:r>
-              <w:t>240</w:t>
+              <w:t>80</w:t>
             </w:r>
           </w:p>
         </w:tc>
@@ -3001,7 +3001,7 @@
           </w:tcPr>
           <w:p>
             <w:r>
-              <w:t>96</w:t>
+              <w:t>80</w:t>
             </w:r>
           </w:p>
         </w:tc>
@@ -4022,6 +4022,11 @@
           <w:szCs w:val="28"/>
         </w:rPr>
       </w:pPr>
+    </w:p>
+    <w:p>
+      <w:r>
+        <w:br w:type="page"/>
+      </w:r>
     </w:p>
     <w:p>
       <w:r>

</xml_diff>

<commit_message>
Add resource planning tables for PR3
Co-authored-by: alexproxor <alexproxor@users.noreply.github.com>
</commit_message>
<xml_diff>
--- a/Прохоров.А.Ф_ПР3.docx
+++ b/Прохоров.А.Ф_ПР3.docx
@@ -4040,6 +4040,16 @@
     </w:p>
     <w:p>
       <w:r>
+        <w:br w:type="page"/>
+      </w:r>
+    </w:p>
+    <w:p>
+      <w:r>
+        <w:br w:type="page"/>
+      </w:r>
+    </w:p>
+    <w:p>
+      <w:r>
         <w:rPr>
           <w:b/>
           <w:sz w:val="25"/>
@@ -4988,6 +4998,28 @@
           <w:p>
             <w:r>
               <w:t>Перечень работ, которые не могут выполняться одновременно</w:t>
+            </w:r>
+          </w:p>
+        </w:tc>
+      </w:tr>
+      <w:tr>
+        <w:tc>
+          <w:tcPr>
+            <w:tcW w:type="dxa" w:w="4677"/>
+          </w:tcPr>
+          <w:p>
+            <w:r>
+              <w:t>2.1</w:t>
+            </w:r>
+          </w:p>
+        </w:tc>
+        <w:tc>
+          <w:tcPr>
+            <w:tcW w:type="dxa" w:w="4677"/>
+          </w:tcPr>
+          <w:p>
+            <w:r>
+              <w:t>2.2</w:t>
             </w:r>
           </w:p>
         </w:tc>
@@ -5220,6 +5252,1881 @@
         <w:t>Рисунок 1 - Сетевая модель проекта ИС «ЖКХ-Заявки»</w:t>
       </w:r>
     </w:p>
+    <w:p/>
+    <w:p>
+      <w:r>
+        <w:rPr>
+          <w:b/>
+          <w:sz w:val="25"/>
+        </w:rPr>
+        <w:t>Назначение ресурсов на выполняемые работы</w:t>
+      </w:r>
+    </w:p>
+    <w:p>
+      <w:r>
+        <w:t>На данном этапе выполняется назначение временных, трудовых, материальных и финансовых ресурсов на работы проекта ИС «ЖКХ-Заявки».</w:t>
+      </w:r>
+    </w:p>
+    <w:p>
+      <w:r>
+        <w:rPr>
+          <w:b/>
+        </w:rPr>
+        <w:t>4.3.1. Временные ресурсы</w:t>
+      </w:r>
+    </w:p>
+    <w:p>
+      <w:r>
+        <w:t>Для оценки продолжительности работ использован метод оценки по аналогам. В качестве экспертов необходимо указать не менее трех студентов группы.</w:t>
+      </w:r>
+    </w:p>
+    <w:p>
+      <w:r>
+        <w:t>Эксперты для последующего заполнения отчета:</w:t>
+      </w:r>
+    </w:p>
+    <w:p>
+      <w:r>
+        <w:t>[Фамилия И.О. эксперта 1]</w:t>
+      </w:r>
+    </w:p>
+    <w:p>
+      <w:r>
+        <w:t>[Фамилия И.О. эксперта 2]</w:t>
+      </w:r>
+    </w:p>
+    <w:p>
+      <w:r>
+        <w:t>[Фамилия И.О. эксперта 3]</w:t>
+      </w:r>
+    </w:p>
+    <w:p>
+      <w:pPr>
+        <w:jc w:val="right"/>
+      </w:pPr>
+      <w:r>
+        <w:rPr>
+          <w:b/>
+        </w:rPr>
+        <w:t>Таблица 4.4</w:t>
+      </w:r>
+    </w:p>
+    <w:tbl>
+      <w:tblPr>
+        <w:tblStyle w:val="a4"/>
+        <w:tblW w:type="auto" w:w="0"/>
+        <w:tblLook w:firstColumn="1" w:firstRow="1" w:lastColumn="0" w:lastRow="0" w:noHBand="0" w:noVBand="1" w:val="04A0"/>
+      </w:tblPr>
+      <w:tblGrid>
+        <w:gridCol w:w="2339"/>
+        <w:gridCol w:w="2339"/>
+        <w:gridCol w:w="2339"/>
+        <w:gridCol w:w="2339"/>
+      </w:tblGrid>
+      <w:tr>
+        <w:tc>
+          <w:tcPr>
+            <w:tcW w:type="dxa" w:w="2339"/>
+          </w:tcPr>
+          <w:p>
+            <w:r>
+              <w:t>Номер работы</w:t>
+            </w:r>
+          </w:p>
+        </w:tc>
+        <w:tc>
+          <w:tcPr>
+            <w:tcW w:type="dxa" w:w="2339"/>
+          </w:tcPr>
+          <w:p>
+            <w:r>
+              <w:t>Продолжительность выполнения, ч</w:t>
+            </w:r>
+          </w:p>
+        </w:tc>
+        <w:tc>
+          <w:tcPr>
+            <w:tcW w:type="dxa" w:w="2339"/>
+          </w:tcPr>
+          <w:p>
+            <w:r>
+              <w:t>Номер работы</w:t>
+            </w:r>
+          </w:p>
+        </w:tc>
+        <w:tc>
+          <w:tcPr>
+            <w:tcW w:type="dxa" w:w="2339"/>
+          </w:tcPr>
+          <w:p>
+            <w:r>
+              <w:t>Продолжительность выполнения, ч</w:t>
+            </w:r>
+          </w:p>
+        </w:tc>
+      </w:tr>
+      <w:tr>
+        <w:tc>
+          <w:tcPr>
+            <w:tcW w:type="dxa" w:w="2339"/>
+          </w:tcPr>
+          <w:p>
+            <w:r>
+              <w:t>1.1</w:t>
+            </w:r>
+          </w:p>
+        </w:tc>
+        <w:tc>
+          <w:tcPr>
+            <w:tcW w:type="dxa" w:w="2339"/>
+          </w:tcPr>
+          <w:p>
+            <w:r>
+              <w:t>16</w:t>
+            </w:r>
+          </w:p>
+        </w:tc>
+        <w:tc>
+          <w:tcPr>
+            <w:tcW w:type="dxa" w:w="2339"/>
+          </w:tcPr>
+          <w:p>
+            <w:r>
+              <w:t>4.4</w:t>
+            </w:r>
+          </w:p>
+        </w:tc>
+        <w:tc>
+          <w:tcPr>
+            <w:tcW w:type="dxa" w:w="2339"/>
+          </w:tcPr>
+          <w:p>
+            <w:r>
+              <w:t>24</w:t>
+            </w:r>
+          </w:p>
+        </w:tc>
+      </w:tr>
+      <w:tr>
+        <w:tc>
+          <w:tcPr>
+            <w:tcW w:type="dxa" w:w="2339"/>
+          </w:tcPr>
+          <w:p>
+            <w:r>
+              <w:t>1.2</w:t>
+            </w:r>
+          </w:p>
+        </w:tc>
+        <w:tc>
+          <w:tcPr>
+            <w:tcW w:type="dxa" w:w="2339"/>
+          </w:tcPr>
+          <w:p>
+            <w:r>
+              <w:t>24</w:t>
+            </w:r>
+          </w:p>
+        </w:tc>
+        <w:tc>
+          <w:tcPr>
+            <w:tcW w:type="dxa" w:w="2339"/>
+          </w:tcPr>
+          <w:p>
+            <w:r>
+              <w:t>4.5</w:t>
+            </w:r>
+          </w:p>
+        </w:tc>
+        <w:tc>
+          <w:tcPr>
+            <w:tcW w:type="dxa" w:w="2339"/>
+          </w:tcPr>
+          <w:p>
+            <w:r>
+              <w:t>40</w:t>
+            </w:r>
+          </w:p>
+        </w:tc>
+      </w:tr>
+      <w:tr>
+        <w:tc>
+          <w:tcPr>
+            <w:tcW w:type="dxa" w:w="2339"/>
+          </w:tcPr>
+          <w:p>
+            <w:r>
+              <w:t>1.3</w:t>
+            </w:r>
+          </w:p>
+        </w:tc>
+        <w:tc>
+          <w:tcPr>
+            <w:tcW w:type="dxa" w:w="2339"/>
+          </w:tcPr>
+          <w:p>
+            <w:r>
+              <w:t>32</w:t>
+            </w:r>
+          </w:p>
+        </w:tc>
+        <w:tc>
+          <w:tcPr>
+            <w:tcW w:type="dxa" w:w="2339"/>
+          </w:tcPr>
+          <w:p>
+            <w:r>
+              <w:t>5.1</w:t>
+            </w:r>
+          </w:p>
+        </w:tc>
+        <w:tc>
+          <w:tcPr>
+            <w:tcW w:type="dxa" w:w="2339"/>
+          </w:tcPr>
+          <w:p>
+            <w:r>
+              <w:t>16</w:t>
+            </w:r>
+          </w:p>
+        </w:tc>
+      </w:tr>
+      <w:tr>
+        <w:tc>
+          <w:tcPr>
+            <w:tcW w:type="dxa" w:w="2339"/>
+          </w:tcPr>
+          <w:p>
+            <w:r>
+              <w:t>2.1</w:t>
+            </w:r>
+          </w:p>
+        </w:tc>
+        <w:tc>
+          <w:tcPr>
+            <w:tcW w:type="dxa" w:w="2339"/>
+          </w:tcPr>
+          <w:p>
+            <w:r>
+              <w:t>24</w:t>
+            </w:r>
+          </w:p>
+        </w:tc>
+        <w:tc>
+          <w:tcPr>
+            <w:tcW w:type="dxa" w:w="2339"/>
+          </w:tcPr>
+          <w:p>
+            <w:r>
+              <w:t>5.2</w:t>
+            </w:r>
+          </w:p>
+        </w:tc>
+        <w:tc>
+          <w:tcPr>
+            <w:tcW w:type="dxa" w:w="2339"/>
+          </w:tcPr>
+          <w:p>
+            <w:r>
+              <w:t>40</w:t>
+            </w:r>
+          </w:p>
+        </w:tc>
+      </w:tr>
+      <w:tr>
+        <w:tc>
+          <w:tcPr>
+            <w:tcW w:type="dxa" w:w="2339"/>
+          </w:tcPr>
+          <w:p>
+            <w:r>
+              <w:t>2.2</w:t>
+            </w:r>
+          </w:p>
+        </w:tc>
+        <w:tc>
+          <w:tcPr>
+            <w:tcW w:type="dxa" w:w="2339"/>
+          </w:tcPr>
+          <w:p>
+            <w:r>
+              <w:t>16</w:t>
+            </w:r>
+          </w:p>
+        </w:tc>
+        <w:tc>
+          <w:tcPr>
+            <w:tcW w:type="dxa" w:w="2339"/>
+          </w:tcPr>
+          <w:p>
+            <w:r>
+              <w:t>5.3</w:t>
+            </w:r>
+          </w:p>
+        </w:tc>
+        <w:tc>
+          <w:tcPr>
+            <w:tcW w:type="dxa" w:w="2339"/>
+          </w:tcPr>
+          <w:p>
+            <w:r>
+              <w:t>16</w:t>
+            </w:r>
+          </w:p>
+        </w:tc>
+      </w:tr>
+      <w:tr>
+        <w:tc>
+          <w:tcPr>
+            <w:tcW w:type="dxa" w:w="2339"/>
+          </w:tcPr>
+          <w:p>
+            <w:r>
+              <w:t>2.3</w:t>
+            </w:r>
+          </w:p>
+        </w:tc>
+        <w:tc>
+          <w:tcPr>
+            <w:tcW w:type="dxa" w:w="2339"/>
+          </w:tcPr>
+          <w:p>
+            <w:r>
+              <w:t>16</w:t>
+            </w:r>
+          </w:p>
+        </w:tc>
+        <w:tc>
+          <w:tcPr>
+            <w:tcW w:type="dxa" w:w="2339"/>
+          </w:tcPr>
+          <w:p>
+            <w:r>
+              <w:t>5.4</w:t>
+            </w:r>
+          </w:p>
+        </w:tc>
+        <w:tc>
+          <w:tcPr>
+            <w:tcW w:type="dxa" w:w="2339"/>
+          </w:tcPr>
+          <w:p>
+            <w:r>
+              <w:t>24</w:t>
+            </w:r>
+          </w:p>
+        </w:tc>
+      </w:tr>
+      <w:tr>
+        <w:tc>
+          <w:tcPr>
+            <w:tcW w:type="dxa" w:w="2339"/>
+          </w:tcPr>
+          <w:p>
+            <w:r>
+              <w:t>3.1</w:t>
+            </w:r>
+          </w:p>
+        </w:tc>
+        <w:tc>
+          <w:tcPr>
+            <w:tcW w:type="dxa" w:w="2339"/>
+          </w:tcPr>
+          <w:p>
+            <w:r>
+              <w:t>24</w:t>
+            </w:r>
+          </w:p>
+        </w:tc>
+        <w:tc>
+          <w:tcPr>
+            <w:tcW w:type="dxa" w:w="2339"/>
+          </w:tcPr>
+          <w:p>
+            <w:r>
+              <w:t>6.1</w:t>
+            </w:r>
+          </w:p>
+        </w:tc>
+        <w:tc>
+          <w:tcPr>
+            <w:tcW w:type="dxa" w:w="2339"/>
+          </w:tcPr>
+          <w:p>
+            <w:r>
+              <w:t>16</w:t>
+            </w:r>
+          </w:p>
+        </w:tc>
+      </w:tr>
+      <w:tr>
+        <w:tc>
+          <w:tcPr>
+            <w:tcW w:type="dxa" w:w="2339"/>
+          </w:tcPr>
+          <w:p>
+            <w:r>
+              <w:t>3.2</w:t>
+            </w:r>
+          </w:p>
+        </w:tc>
+        <w:tc>
+          <w:tcPr>
+            <w:tcW w:type="dxa" w:w="2339"/>
+          </w:tcPr>
+          <w:p>
+            <w:r>
+              <w:t>16</w:t>
+            </w:r>
+          </w:p>
+        </w:tc>
+        <w:tc>
+          <w:tcPr>
+            <w:tcW w:type="dxa" w:w="2339"/>
+          </w:tcPr>
+          <w:p>
+            <w:r>
+              <w:t>6.2</w:t>
+            </w:r>
+          </w:p>
+        </w:tc>
+        <w:tc>
+          <w:tcPr>
+            <w:tcW w:type="dxa" w:w="2339"/>
+          </w:tcPr>
+          <w:p>
+            <w:r>
+              <w:t>16</w:t>
+            </w:r>
+          </w:p>
+        </w:tc>
+      </w:tr>
+      <w:tr>
+        <w:tc>
+          <w:tcPr>
+            <w:tcW w:type="dxa" w:w="2339"/>
+          </w:tcPr>
+          <w:p>
+            <w:r>
+              <w:t>3.3</w:t>
+            </w:r>
+          </w:p>
+        </w:tc>
+        <w:tc>
+          <w:tcPr>
+            <w:tcW w:type="dxa" w:w="2339"/>
+          </w:tcPr>
+          <w:p>
+            <w:r>
+              <w:t>16</w:t>
+            </w:r>
+          </w:p>
+        </w:tc>
+        <w:tc>
+          <w:tcPr>
+            <w:tcW w:type="dxa" w:w="2339"/>
+          </w:tcPr>
+          <w:p>
+            <w:r>
+              <w:t>6.3</w:t>
+            </w:r>
+          </w:p>
+        </w:tc>
+        <w:tc>
+          <w:tcPr>
+            <w:tcW w:type="dxa" w:w="2339"/>
+          </w:tcPr>
+          <w:p>
+            <w:r>
+              <w:t>16</w:t>
+            </w:r>
+          </w:p>
+        </w:tc>
+      </w:tr>
+      <w:tr>
+        <w:tc>
+          <w:tcPr>
+            <w:tcW w:type="dxa" w:w="2339"/>
+          </w:tcPr>
+          <w:p>
+            <w:r>
+              <w:t>3.4</w:t>
+            </w:r>
+          </w:p>
+        </w:tc>
+        <w:tc>
+          <w:tcPr>
+            <w:tcW w:type="dxa" w:w="2339"/>
+          </w:tcPr>
+          <w:p>
+            <w:r>
+              <w:t>16</w:t>
+            </w:r>
+          </w:p>
+        </w:tc>
+        <w:tc>
+          <w:tcPr>
+            <w:tcW w:type="dxa" w:w="2339"/>
+          </w:tcPr>
+          <w:p>
+            <w:r>
+              <w:t>6.4</w:t>
+            </w:r>
+          </w:p>
+        </w:tc>
+        <w:tc>
+          <w:tcPr>
+            <w:tcW w:type="dxa" w:w="2339"/>
+          </w:tcPr>
+          <w:p>
+            <w:r>
+              <w:t>24</w:t>
+            </w:r>
+          </w:p>
+        </w:tc>
+      </w:tr>
+      <w:tr>
+        <w:tc>
+          <w:tcPr>
+            <w:tcW w:type="dxa" w:w="2339"/>
+          </w:tcPr>
+          <w:p>
+            <w:r>
+              <w:t>4.1</w:t>
+            </w:r>
+          </w:p>
+        </w:tc>
+        <w:tc>
+          <w:tcPr>
+            <w:tcW w:type="dxa" w:w="2339"/>
+          </w:tcPr>
+          <w:p>
+            <w:r>
+              <w:t>64</w:t>
+            </w:r>
+          </w:p>
+        </w:tc>
+        <w:tc>
+          <w:tcPr>
+            <w:tcW w:type="dxa" w:w="2339"/>
+          </w:tcPr>
+          <w:p>
+            <w:r>
+              <w:t>7.1</w:t>
+            </w:r>
+          </w:p>
+        </w:tc>
+        <w:tc>
+          <w:tcPr>
+            <w:tcW w:type="dxa" w:w="2339"/>
+          </w:tcPr>
+          <w:p>
+            <w:r>
+              <w:t>8</w:t>
+            </w:r>
+          </w:p>
+        </w:tc>
+      </w:tr>
+      <w:tr>
+        <w:tc>
+          <w:tcPr>
+            <w:tcW w:type="dxa" w:w="2339"/>
+          </w:tcPr>
+          <w:p>
+            <w:r>
+              <w:t>4.2</w:t>
+            </w:r>
+          </w:p>
+        </w:tc>
+        <w:tc>
+          <w:tcPr>
+            <w:tcW w:type="dxa" w:w="2339"/>
+          </w:tcPr>
+          <w:p>
+            <w:r>
+              <w:t>56</w:t>
+            </w:r>
+          </w:p>
+        </w:tc>
+        <w:tc>
+          <w:tcPr>
+            <w:tcW w:type="dxa" w:w="2339"/>
+          </w:tcPr>
+          <w:p>
+            <w:r>
+              <w:t>7.2</w:t>
+            </w:r>
+          </w:p>
+        </w:tc>
+        <w:tc>
+          <w:tcPr>
+            <w:tcW w:type="dxa" w:w="2339"/>
+          </w:tcPr>
+          <w:p>
+            <w:r>
+              <w:t>8</w:t>
+            </w:r>
+          </w:p>
+        </w:tc>
+      </w:tr>
+      <w:tr>
+        <w:tc>
+          <w:tcPr>
+            <w:tcW w:type="dxa" w:w="2339"/>
+          </w:tcPr>
+          <w:p>
+            <w:r>
+              <w:t>4.3</w:t>
+            </w:r>
+          </w:p>
+        </w:tc>
+        <w:tc>
+          <w:tcPr>
+            <w:tcW w:type="dxa" w:w="2339"/>
+          </w:tcPr>
+          <w:p>
+            <w:r>
+              <w:t>56</w:t>
+            </w:r>
+          </w:p>
+        </w:tc>
+        <w:tc>
+          <w:tcPr>
+            <w:tcW w:type="dxa" w:w="2339"/>
+          </w:tcPr>
+          <w:p>
+            <w:r>
+              <w:t>7.3</w:t>
+            </w:r>
+          </w:p>
+        </w:tc>
+        <w:tc>
+          <w:tcPr>
+            <w:tcW w:type="dxa" w:w="2339"/>
+          </w:tcPr>
+          <w:p>
+            <w:r>
+              <w:t>8</w:t>
+            </w:r>
+          </w:p>
+        </w:tc>
+      </w:tr>
+    </w:tbl>
+    <w:p>
+      <w:r>
+        <w:rPr>
+          <w:b/>
+        </w:rPr>
+        <w:t>4.3.2. Трудовые, материальные и финансовые ресурсы</w:t>
+      </w:r>
+    </w:p>
+    <w:p>
+      <w:r>
+        <w:t>Для выполнения работ проекта определены трудовые ресурсы команды, используемые материалы и фиксированные затраты. Итоговые назначения представлены в таблице 4.5.</w:t>
+      </w:r>
+    </w:p>
+    <w:p>
+      <w:pPr>
+        <w:jc w:val="right"/>
+      </w:pPr>
+      <w:r>
+        <w:rPr>
+          <w:b/>
+        </w:rPr>
+        <w:t>Таблица 4.5</w:t>
+      </w:r>
+    </w:p>
+    <w:tbl>
+      <w:tblPr>
+        <w:tblStyle w:val="a4"/>
+        <w:tblW w:type="auto" w:w="0"/>
+        <w:tblLook w:firstColumn="1" w:firstRow="1" w:lastColumn="0" w:lastRow="0" w:noHBand="0" w:noVBand="1" w:val="04A0"/>
+      </w:tblPr>
+      <w:tblGrid>
+        <w:gridCol w:w="2339"/>
+        <w:gridCol w:w="2339"/>
+        <w:gridCol w:w="2339"/>
+        <w:gridCol w:w="2339"/>
+      </w:tblGrid>
+      <w:tr>
+        <w:tc>
+          <w:tcPr>
+            <w:tcW w:type="dxa" w:w="2339"/>
+          </w:tcPr>
+          <w:p>
+            <w:r>
+              <w:t>Номер работы</w:t>
+            </w:r>
+          </w:p>
+        </w:tc>
+        <w:tc>
+          <w:tcPr>
+            <w:tcW w:type="dxa" w:w="2339"/>
+          </w:tcPr>
+          <w:p>
+            <w:r>
+              <w:t>Трудовые ресурсы</w:t>
+            </w:r>
+          </w:p>
+        </w:tc>
+        <w:tc>
+          <w:tcPr>
+            <w:tcW w:type="dxa" w:w="2339"/>
+          </w:tcPr>
+          <w:p>
+            <w:r>
+              <w:t>Материальные ресурсы</w:t>
+            </w:r>
+          </w:p>
+        </w:tc>
+        <w:tc>
+          <w:tcPr>
+            <w:tcW w:type="dxa" w:w="2339"/>
+          </w:tcPr>
+          <w:p>
+            <w:r>
+              <w:t>Фиксированные затраты</w:t>
+            </w:r>
+          </w:p>
+        </w:tc>
+      </w:tr>
+      <w:tr>
+        <w:tc>
+          <w:tcPr>
+            <w:tcW w:type="dxa" w:w="2339"/>
+          </w:tcPr>
+          <w:p>
+            <w:r>
+              <w:t>1.1</w:t>
+            </w:r>
+          </w:p>
+        </w:tc>
+        <w:tc>
+          <w:tcPr>
+            <w:tcW w:type="dxa" w:w="2339"/>
+          </w:tcPr>
+          <w:p>
+            <w:r>
+              <w:t>- Руководитель проекта - 0,5 чел.</w:t>
+              <w:br/>
+              <w:t>- Бизнес-аналитик - 0,25 чел.</w:t>
+            </w:r>
+          </w:p>
+        </w:tc>
+        <w:tc>
+          <w:tcPr>
+            <w:tcW w:type="dxa" w:w="2339"/>
+          </w:tcPr>
+          <w:p>
+            <w:r>
+              <w:t>Канцелярские материалы, шаблон устава проекта.</w:t>
+            </w:r>
+          </w:p>
+        </w:tc>
+        <w:tc>
+          <w:tcPr>
+            <w:tcW w:type="dxa" w:w="2339"/>
+          </w:tcPr>
+          <w:p>
+            <w:r>
+              <w:t>8 тыс. руб.</w:t>
+            </w:r>
+          </w:p>
+        </w:tc>
+      </w:tr>
+      <w:tr>
+        <w:tc>
+          <w:tcPr>
+            <w:tcW w:type="dxa" w:w="2339"/>
+          </w:tcPr>
+          <w:p>
+            <w:r>
+              <w:t>1.2</w:t>
+            </w:r>
+          </w:p>
+        </w:tc>
+        <w:tc>
+          <w:tcPr>
+            <w:tcW w:type="dxa" w:w="2339"/>
+          </w:tcPr>
+          <w:p>
+            <w:r>
+              <w:t>- Руководитель проекта - 0,5 чел.</w:t>
+              <w:br/>
+              <w:t>- Представитель заказчика - 0,25 чел.</w:t>
+            </w:r>
+          </w:p>
+        </w:tc>
+        <w:tc>
+          <w:tcPr>
+            <w:tcW w:type="dxa" w:w="2339"/>
+          </w:tcPr>
+          <w:p>
+            <w:r>
+              <w:t>Материалы стратегической сессии, шаблоны целей и KPI.</w:t>
+            </w:r>
+          </w:p>
+        </w:tc>
+        <w:tc>
+          <w:tcPr>
+            <w:tcW w:type="dxa" w:w="2339"/>
+          </w:tcPr>
+          <w:p>
+            <w:r>
+              <w:t>10 тыс. руб.</w:t>
+            </w:r>
+          </w:p>
+        </w:tc>
+      </w:tr>
+      <w:tr>
+        <w:tc>
+          <w:tcPr>
+            <w:tcW w:type="dxa" w:w="2339"/>
+          </w:tcPr>
+          <w:p>
+            <w:r>
+              <w:t>1.3</w:t>
+            </w:r>
+          </w:p>
+        </w:tc>
+        <w:tc>
+          <w:tcPr>
+            <w:tcW w:type="dxa" w:w="2339"/>
+          </w:tcPr>
+          <w:p>
+            <w:r>
+              <w:t>- Руководитель проекта - 0,5 чел.</w:t>
+              <w:br/>
+              <w:t>- Финансовый аналитик - 0,25 чел.</w:t>
+            </w:r>
+          </w:p>
+        </w:tc>
+        <w:tc>
+          <w:tcPr>
+            <w:tcW w:type="dxa" w:w="2339"/>
+          </w:tcPr>
+          <w:p>
+            <w:r>
+              <w:t>Шаблоны календарного плана, реестр рисков.</w:t>
+            </w:r>
+          </w:p>
+        </w:tc>
+        <w:tc>
+          <w:tcPr>
+            <w:tcW w:type="dxa" w:w="2339"/>
+          </w:tcPr>
+          <w:p>
+            <w:r>
+              <w:t>12 тыс. руб.</w:t>
+            </w:r>
+          </w:p>
+        </w:tc>
+      </w:tr>
+      <w:tr>
+        <w:tc>
+          <w:tcPr>
+            <w:tcW w:type="dxa" w:w="2339"/>
+          </w:tcPr>
+          <w:p>
+            <w:r>
+              <w:t>2.1</w:t>
+            </w:r>
+          </w:p>
+        </w:tc>
+        <w:tc>
+          <w:tcPr>
+            <w:tcW w:type="dxa" w:w="2339"/>
+          </w:tcPr>
+          <w:p>
+            <w:r>
+              <w:t>- Бизнес-аналитик - 1 чел.</w:t>
+              <w:br/>
+              <w:t>- Системный аналитик - 0,5 чел.</w:t>
+            </w:r>
+          </w:p>
+        </w:tc>
+        <w:tc>
+          <w:tcPr>
+            <w:tcW w:type="dxa" w:w="2339"/>
+          </w:tcPr>
+          <w:p>
+            <w:r>
+              <w:t>Опросные листы, средства записи интервью, рабочие тетради обследования.</w:t>
+            </w:r>
+          </w:p>
+        </w:tc>
+        <w:tc>
+          <w:tcPr>
+            <w:tcW w:type="dxa" w:w="2339"/>
+          </w:tcPr>
+          <w:p>
+            <w:r>
+              <w:t>15 тыс. руб.</w:t>
+            </w:r>
+          </w:p>
+        </w:tc>
+      </w:tr>
+      <w:tr>
+        <w:tc>
+          <w:tcPr>
+            <w:tcW w:type="dxa" w:w="2339"/>
+          </w:tcPr>
+          <w:p>
+            <w:r>
+              <w:t>2.2</w:t>
+            </w:r>
+          </w:p>
+        </w:tc>
+        <w:tc>
+          <w:tcPr>
+            <w:tcW w:type="dxa" w:w="2339"/>
+          </w:tcPr>
+          <w:p>
+            <w:r>
+              <w:t>- Бизнес-аналитик - 1 чел.</w:t>
+            </w:r>
+          </w:p>
+        </w:tc>
+        <w:tc>
+          <w:tcPr>
+            <w:tcW w:type="dxa" w:w="2339"/>
+          </w:tcPr>
+          <w:p>
+            <w:r>
+              <w:t>Шаблоны BPMN/AS-IS диаграмм, канцелярские материалы.</w:t>
+            </w:r>
+          </w:p>
+        </w:tc>
+        <w:tc>
+          <w:tcPr>
+            <w:tcW w:type="dxa" w:w="2339"/>
+          </w:tcPr>
+          <w:p>
+            <w:r>
+              <w:t>8 тыс. руб.</w:t>
+            </w:r>
+          </w:p>
+        </w:tc>
+      </w:tr>
+      <w:tr>
+        <w:tc>
+          <w:tcPr>
+            <w:tcW w:type="dxa" w:w="2339"/>
+          </w:tcPr>
+          <w:p>
+            <w:r>
+              <w:t>2.3</w:t>
+            </w:r>
+          </w:p>
+        </w:tc>
+        <w:tc>
+          <w:tcPr>
+            <w:tcW w:type="dxa" w:w="2339"/>
+          </w:tcPr>
+          <w:p>
+            <w:r>
+              <w:t>- Системный аналитик - 1 чел.</w:t>
+              <w:br/>
+              <w:t>- Бизнес-аналитик - 0,5 чел.</w:t>
+            </w:r>
+          </w:p>
+        </w:tc>
+        <w:tc>
+          <w:tcPr>
+            <w:tcW w:type="dxa" w:w="2339"/>
+          </w:tcPr>
+          <w:p>
+            <w:r>
+              <w:t>Шаблон спецификации требований, реестр требований.</w:t>
+            </w:r>
+          </w:p>
+        </w:tc>
+        <w:tc>
+          <w:tcPr>
+            <w:tcW w:type="dxa" w:w="2339"/>
+          </w:tcPr>
+          <w:p>
+            <w:r>
+              <w:t>10 тыс. руб.</w:t>
+            </w:r>
+          </w:p>
+        </w:tc>
+      </w:tr>
+      <w:tr>
+        <w:tc>
+          <w:tcPr>
+            <w:tcW w:type="dxa" w:w="2339"/>
+          </w:tcPr>
+          <w:p>
+            <w:r>
+              <w:t>3.1</w:t>
+            </w:r>
+          </w:p>
+        </w:tc>
+        <w:tc>
+          <w:tcPr>
+            <w:tcW w:type="dxa" w:w="2339"/>
+          </w:tcPr>
+          <w:p>
+            <w:r>
+              <w:t>- Системный архитектор - 1 чел.</w:t>
+              <w:br/>
+              <w:t>- Системный аналитик - 0,5 чел.</w:t>
+            </w:r>
+          </w:p>
+        </w:tc>
+        <w:tc>
+          <w:tcPr>
+            <w:tcW w:type="dxa" w:w="2339"/>
+          </w:tcPr>
+          <w:p>
+            <w:r>
+              <w:t>Средства моделирования архитектуры, репозиторий проектных решений.</w:t>
+            </w:r>
+          </w:p>
+        </w:tc>
+        <w:tc>
+          <w:tcPr>
+            <w:tcW w:type="dxa" w:w="2339"/>
+          </w:tcPr>
+          <w:p>
+            <w:r>
+              <w:t>20 тыс. руб.</w:t>
+            </w:r>
+          </w:p>
+        </w:tc>
+      </w:tr>
+      <w:tr>
+        <w:tc>
+          <w:tcPr>
+            <w:tcW w:type="dxa" w:w="2339"/>
+          </w:tcPr>
+          <w:p>
+            <w:r>
+              <w:t>3.2</w:t>
+            </w:r>
+          </w:p>
+        </w:tc>
+        <w:tc>
+          <w:tcPr>
+            <w:tcW w:type="dxa" w:w="2339"/>
+          </w:tcPr>
+          <w:p>
+            <w:r>
+              <w:t>- Архитектор БД - 1 чел.</w:t>
+            </w:r>
+          </w:p>
+        </w:tc>
+        <w:tc>
+          <w:tcPr>
+            <w:tcW w:type="dxa" w:w="2339"/>
+          </w:tcPr>
+          <w:p>
+            <w:r>
+              <w:t>Шаблоны ER-диаграмм, модель данных, справочники предметной области.</w:t>
+            </w:r>
+          </w:p>
+        </w:tc>
+        <w:tc>
+          <w:tcPr>
+            <w:tcW w:type="dxa" w:w="2339"/>
+          </w:tcPr>
+          <w:p>
+            <w:r>
+              <w:t>12 тыс. руб.</w:t>
+            </w:r>
+          </w:p>
+        </w:tc>
+      </w:tr>
+      <w:tr>
+        <w:tc>
+          <w:tcPr>
+            <w:tcW w:type="dxa" w:w="2339"/>
+          </w:tcPr>
+          <w:p>
+            <w:r>
+              <w:t>3.3</w:t>
+            </w:r>
+          </w:p>
+        </w:tc>
+        <w:tc>
+          <w:tcPr>
+            <w:tcW w:type="dxa" w:w="2339"/>
+          </w:tcPr>
+          <w:p>
+            <w:r>
+              <w:t>- UX/UI-дизайнер - 1 чел.</w:t>
+            </w:r>
+          </w:p>
+        </w:tc>
+        <w:tc>
+          <w:tcPr>
+            <w:tcW w:type="dxa" w:w="2339"/>
+          </w:tcPr>
+          <w:p>
+            <w:r>
+              <w:t>Дизайн-система, библиотека компонентов, прототипы экранов.</w:t>
+            </w:r>
+          </w:p>
+        </w:tc>
+        <w:tc>
+          <w:tcPr>
+            <w:tcW w:type="dxa" w:w="2339"/>
+          </w:tcPr>
+          <w:p>
+            <w:r>
+              <w:t>18 тыс. руб.</w:t>
+            </w:r>
+          </w:p>
+        </w:tc>
+      </w:tr>
+      <w:tr>
+        <w:tc>
+          <w:tcPr>
+            <w:tcW w:type="dxa" w:w="2339"/>
+          </w:tcPr>
+          <w:p>
+            <w:r>
+              <w:t>3.4</w:t>
+            </w:r>
+          </w:p>
+        </w:tc>
+        <w:tc>
+          <w:tcPr>
+            <w:tcW w:type="dxa" w:w="2339"/>
+          </w:tcPr>
+          <w:p>
+            <w:r>
+              <w:t>- Системный аналитик - 1 чел.</w:t>
+              <w:br/>
+              <w:t>- Руководитель проекта - 0,25 чел.</w:t>
+            </w:r>
+          </w:p>
+        </w:tc>
+        <w:tc>
+          <w:tcPr>
+            <w:tcW w:type="dxa" w:w="2339"/>
+          </w:tcPr>
+          <w:p>
+            <w:r>
+              <w:t>Утвержденный шаблон ТЗ, комплект исходных требований.</w:t>
+            </w:r>
+          </w:p>
+        </w:tc>
+        <w:tc>
+          <w:tcPr>
+            <w:tcW w:type="dxa" w:w="2339"/>
+          </w:tcPr>
+          <w:p>
+            <w:r>
+              <w:t>8 тыс. руб.</w:t>
+            </w:r>
+          </w:p>
+        </w:tc>
+      </w:tr>
+      <w:tr>
+        <w:tc>
+          <w:tcPr>
+            <w:tcW w:type="dxa" w:w="2339"/>
+          </w:tcPr>
+          <w:p>
+            <w:r>
+              <w:t>4.1</w:t>
+            </w:r>
+          </w:p>
+        </w:tc>
+        <w:tc>
+          <w:tcPr>
+            <w:tcW w:type="dxa" w:w="2339"/>
+          </w:tcPr>
+          <w:p>
+            <w:r>
+              <w:t>- Backend-разработчик - 1 чел.</w:t>
+              <w:br/>
+              <w:t>- Системный аналитик - 0,25 чел.</w:t>
+            </w:r>
+          </w:p>
+        </w:tc>
+        <w:tc>
+          <w:tcPr>
+            <w:tcW w:type="dxa" w:w="2339"/>
+          </w:tcPr>
+          <w:p>
+            <w:r>
+              <w:t>Среда разработки, тестовый сервер, репозиторий исходного кода.</w:t>
+            </w:r>
+          </w:p>
+        </w:tc>
+        <w:tc>
+          <w:tcPr>
+            <w:tcW w:type="dxa" w:w="2339"/>
+          </w:tcPr>
+          <w:p>
+            <w:r>
+              <w:t>35 тыс. руб.</w:t>
+            </w:r>
+          </w:p>
+        </w:tc>
+      </w:tr>
+      <w:tr>
+        <w:tc>
+          <w:tcPr>
+            <w:tcW w:type="dxa" w:w="2339"/>
+          </w:tcPr>
+          <w:p>
+            <w:r>
+              <w:t>4.2</w:t>
+            </w:r>
+          </w:p>
+        </w:tc>
+        <w:tc>
+          <w:tcPr>
+            <w:tcW w:type="dxa" w:w="2339"/>
+          </w:tcPr>
+          <w:p>
+            <w:r>
+              <w:t>- Frontend-разработчик - 1 чел.</w:t>
+            </w:r>
+          </w:p>
+        </w:tc>
+        <w:tc>
+          <w:tcPr>
+            <w:tcW w:type="dxa" w:w="2339"/>
+          </w:tcPr>
+          <w:p>
+            <w:r>
+              <w:t>UI-kit, тестовое мобильное устройство, макеты интерфейсов.</w:t>
+            </w:r>
+          </w:p>
+        </w:tc>
+        <w:tc>
+          <w:tcPr>
+            <w:tcW w:type="dxa" w:w="2339"/>
+          </w:tcPr>
+          <w:p>
+            <w:r>
+              <w:t>28 тыс. руб.</w:t>
+            </w:r>
+          </w:p>
+        </w:tc>
+      </w:tr>
+      <w:tr>
+        <w:tc>
+          <w:tcPr>
+            <w:tcW w:type="dxa" w:w="2339"/>
+          </w:tcPr>
+          <w:p>
+            <w:r>
+              <w:t>4.3</w:t>
+            </w:r>
+          </w:p>
+        </w:tc>
+        <w:tc>
+          <w:tcPr>
+            <w:tcW w:type="dxa" w:w="2339"/>
+          </w:tcPr>
+          <w:p>
+            <w:r>
+              <w:t>- Backend-разработчик - 0,5 чел.</w:t>
+              <w:br/>
+              <w:t>- Frontend-разработчик - 0,5 чел.</w:t>
+            </w:r>
+          </w:p>
+        </w:tc>
+        <w:tc>
+          <w:tcPr>
+            <w:tcW w:type="dxa" w:w="2339"/>
+          </w:tcPr>
+          <w:p>
+            <w:r>
+              <w:t>Тестовые учетные записи, сервер приложений, API-спецификация.</w:t>
+            </w:r>
+          </w:p>
+        </w:tc>
+        <w:tc>
+          <w:tcPr>
+            <w:tcW w:type="dxa" w:w="2339"/>
+          </w:tcPr>
+          <w:p>
+            <w:r>
+              <w:t>30 тыс. руб.</w:t>
+            </w:r>
+          </w:p>
+        </w:tc>
+      </w:tr>
+      <w:tr>
+        <w:tc>
+          <w:tcPr>
+            <w:tcW w:type="dxa" w:w="2339"/>
+          </w:tcPr>
+          <w:p>
+            <w:r>
+              <w:t>4.4</w:t>
+            </w:r>
+          </w:p>
+        </w:tc>
+        <w:tc>
+          <w:tcPr>
+            <w:tcW w:type="dxa" w:w="2339"/>
+          </w:tcPr>
+          <w:p>
+            <w:r>
+              <w:t>- Backend-разработчик - 0,5 чел.</w:t>
+              <w:br/>
+              <w:t>- Инженер по интеграциям - 0,5 чел.</w:t>
+            </w:r>
+          </w:p>
+        </w:tc>
+        <w:tc>
+          <w:tcPr>
+            <w:tcW w:type="dxa" w:w="2339"/>
+          </w:tcPr>
+          <w:p>
+            <w:r>
+              <w:t>Тестовый SMS-шлюз, учетная запись почтового сервиса, шаблоны уведомлений.</w:t>
+            </w:r>
+          </w:p>
+        </w:tc>
+        <w:tc>
+          <w:tcPr>
+            <w:tcW w:type="dxa" w:w="2339"/>
+          </w:tcPr>
+          <w:p>
+            <w:r>
+              <w:t>25 тыс. руб.</w:t>
+            </w:r>
+          </w:p>
+        </w:tc>
+      </w:tr>
+      <w:tr>
+        <w:tc>
+          <w:tcPr>
+            <w:tcW w:type="dxa" w:w="2339"/>
+          </w:tcPr>
+          <w:p>
+            <w:r>
+              <w:t>4.5</w:t>
+            </w:r>
+          </w:p>
+        </w:tc>
+        <w:tc>
+          <w:tcPr>
+            <w:tcW w:type="dxa" w:w="2339"/>
+          </w:tcPr>
+          <w:p>
+            <w:r>
+              <w:t>- BI-аналитик - 0,5 чел.</w:t>
+              <w:br/>
+              <w:t>- Backend-разработчик - 0,5 чел.</w:t>
+            </w:r>
+          </w:p>
+        </w:tc>
+        <w:tc>
+          <w:tcPr>
+            <w:tcW w:type="dxa" w:w="2339"/>
+          </w:tcPr>
+          <w:p>
+            <w:r>
+              <w:t>Тестовый набор данных, шаблоны отчетов и дашбордов.</w:t>
+            </w:r>
+          </w:p>
+        </w:tc>
+        <w:tc>
+          <w:tcPr>
+            <w:tcW w:type="dxa" w:w="2339"/>
+          </w:tcPr>
+          <w:p>
+            <w:r>
+              <w:t>20 тыс. руб.</w:t>
+            </w:r>
+          </w:p>
+        </w:tc>
+      </w:tr>
+      <w:tr>
+        <w:tc>
+          <w:tcPr>
+            <w:tcW w:type="dxa" w:w="2339"/>
+          </w:tcPr>
+          <w:p>
+            <w:r>
+              <w:t>5.1</w:t>
+            </w:r>
+          </w:p>
+        </w:tc>
+        <w:tc>
+          <w:tcPr>
+            <w:tcW w:type="dxa" w:w="2339"/>
+          </w:tcPr>
+          <w:p>
+            <w:r>
+              <w:t>- Тестировщик - 1 чел.</w:t>
+            </w:r>
+          </w:p>
+        </w:tc>
+        <w:tc>
+          <w:tcPr>
+            <w:tcW w:type="dxa" w:w="2339"/>
+          </w:tcPr>
+          <w:p>
+            <w:r>
+              <w:t>Шаблоны тест-кейсов, чек-листы приемки.</w:t>
+            </w:r>
+          </w:p>
+        </w:tc>
+        <w:tc>
+          <w:tcPr>
+            <w:tcW w:type="dxa" w:w="2339"/>
+          </w:tcPr>
+          <w:p>
+            <w:r>
+              <w:t>8 тыс. руб.</w:t>
+            </w:r>
+          </w:p>
+        </w:tc>
+      </w:tr>
+      <w:tr>
+        <w:tc>
+          <w:tcPr>
+            <w:tcW w:type="dxa" w:w="2339"/>
+          </w:tcPr>
+          <w:p>
+            <w:r>
+              <w:t>5.2</w:t>
+            </w:r>
+          </w:p>
+        </w:tc>
+        <w:tc>
+          <w:tcPr>
+            <w:tcW w:type="dxa" w:w="2339"/>
+          </w:tcPr>
+          <w:p>
+            <w:r>
+              <w:t>- Тестировщик - 1 чел.</w:t>
+              <w:br/>
+              <w:t>- Системный аналитик - 0,25 чел.</w:t>
+            </w:r>
+          </w:p>
+        </w:tc>
+        <w:tc>
+          <w:tcPr>
+            <w:tcW w:type="dxa" w:w="2339"/>
+          </w:tcPr>
+          <w:p>
+            <w:r>
+              <w:t>Тестовый стенд, баг-трекер, комплект тестовых сценариев.</w:t>
+            </w:r>
+          </w:p>
+        </w:tc>
+        <w:tc>
+          <w:tcPr>
+            <w:tcW w:type="dxa" w:w="2339"/>
+          </w:tcPr>
+          <w:p>
+            <w:r>
+              <w:t>18 тыс. руб.</w:t>
+            </w:r>
+          </w:p>
+        </w:tc>
+      </w:tr>
+      <w:tr>
+        <w:tc>
+          <w:tcPr>
+            <w:tcW w:type="dxa" w:w="2339"/>
+          </w:tcPr>
+          <w:p>
+            <w:r>
+              <w:t>5.3</w:t>
+            </w:r>
+          </w:p>
+        </w:tc>
+        <w:tc>
+          <w:tcPr>
+            <w:tcW w:type="dxa" w:w="2339"/>
+          </w:tcPr>
+          <w:p>
+            <w:r>
+              <w:t>- Инженер по нагрузочному тестированию - 0,5 чел.</w:t>
+              <w:br/>
+              <w:t>- DevOps-инженер - 0,25 чел.</w:t>
+            </w:r>
+          </w:p>
+        </w:tc>
+        <w:tc>
+          <w:tcPr>
+            <w:tcW w:type="dxa" w:w="2339"/>
+          </w:tcPr>
+          <w:p>
+            <w:r>
+              <w:t>Инструмент нагрузочного тестирования, выделенный тестовый контур.</w:t>
+            </w:r>
+          </w:p>
+        </w:tc>
+        <w:tc>
+          <w:tcPr>
+            <w:tcW w:type="dxa" w:w="2339"/>
+          </w:tcPr>
+          <w:p>
+            <w:r>
+              <w:t>16 тыс. руб.</w:t>
+            </w:r>
+          </w:p>
+        </w:tc>
+      </w:tr>
+      <w:tr>
+        <w:tc>
+          <w:tcPr>
+            <w:tcW w:type="dxa" w:w="2339"/>
+          </w:tcPr>
+          <w:p>
+            <w:r>
+              <w:t>5.4</w:t>
+            </w:r>
+          </w:p>
+        </w:tc>
+        <w:tc>
+          <w:tcPr>
+            <w:tcW w:type="dxa" w:w="2339"/>
+          </w:tcPr>
+          <w:p>
+            <w:r>
+              <w:t>- Тестировщик - 0,5 чел.</w:t>
+              <w:br/>
+              <w:t>- Разработчик - 0,5 чел.</w:t>
+            </w:r>
+          </w:p>
+        </w:tc>
+        <w:tc>
+          <w:tcPr>
+            <w:tcW w:type="dxa" w:w="2339"/>
+          </w:tcPr>
+          <w:p>
+            <w:r>
+              <w:t>Журнал дефектов, отчеты о тестировании, регрессионный набор.</w:t>
+            </w:r>
+          </w:p>
+        </w:tc>
+        <w:tc>
+          <w:tcPr>
+            <w:tcW w:type="dxa" w:w="2339"/>
+          </w:tcPr>
+          <w:p>
+            <w:r>
+              <w:t>12 тыс. руб.</w:t>
+            </w:r>
+          </w:p>
+        </w:tc>
+      </w:tr>
+      <w:tr>
+        <w:tc>
+          <w:tcPr>
+            <w:tcW w:type="dxa" w:w="2339"/>
+          </w:tcPr>
+          <w:p>
+            <w:r>
+              <w:t>6.1</w:t>
+            </w:r>
+          </w:p>
+        </w:tc>
+        <w:tc>
+          <w:tcPr>
+            <w:tcW w:type="dxa" w:w="2339"/>
+          </w:tcPr>
+          <w:p>
+            <w:r>
+              <w:t>- DevOps-инженер - 1 чел.</w:t>
+            </w:r>
+          </w:p>
+        </w:tc>
+        <w:tc>
+          <w:tcPr>
+            <w:tcW w:type="dxa" w:w="2339"/>
+          </w:tcPr>
+          <w:p>
+            <w:r>
+              <w:t>Облачная виртуальная машина, скрипты развертывания, сертификаты доступа.</w:t>
+            </w:r>
+          </w:p>
+        </w:tc>
+        <w:tc>
+          <w:tcPr>
+            <w:tcW w:type="dxa" w:w="2339"/>
+          </w:tcPr>
+          <w:p>
+            <w:r>
+              <w:t>32 тыс. руб.</w:t>
+            </w:r>
+          </w:p>
+        </w:tc>
+      </w:tr>
+      <w:tr>
+        <w:tc>
+          <w:tcPr>
+            <w:tcW w:type="dxa" w:w="2339"/>
+          </w:tcPr>
+          <w:p>
+            <w:r>
+              <w:t>6.2</w:t>
+            </w:r>
+          </w:p>
+        </w:tc>
+        <w:tc>
+          <w:tcPr>
+            <w:tcW w:type="dxa" w:w="2339"/>
+          </w:tcPr>
+          <w:p>
+            <w:r>
+              <w:t>- Администратор БД - 0,5 чел.</w:t>
+              <w:br/>
+              <w:t>- DevOps-инженер - 0,5 чел.</w:t>
+            </w:r>
+          </w:p>
+        </w:tc>
+        <w:tc>
+          <w:tcPr>
+            <w:tcW w:type="dxa" w:w="2339"/>
+          </w:tcPr>
+          <w:p>
+            <w:r>
+              <w:t>Скрипты миграции, резервные копии, хранилище данных.</w:t>
+            </w:r>
+          </w:p>
+        </w:tc>
+        <w:tc>
+          <w:tcPr>
+            <w:tcW w:type="dxa" w:w="2339"/>
+          </w:tcPr>
+          <w:p>
+            <w:r>
+              <w:t>22 тыс. руб.</w:t>
+            </w:r>
+          </w:p>
+        </w:tc>
+      </w:tr>
+      <w:tr>
+        <w:tc>
+          <w:tcPr>
+            <w:tcW w:type="dxa" w:w="2339"/>
+          </w:tcPr>
+          <w:p>
+            <w:r>
+              <w:t>6.3</w:t>
+            </w:r>
+          </w:p>
+        </w:tc>
+        <w:tc>
+          <w:tcPr>
+            <w:tcW w:type="dxa" w:w="2339"/>
+          </w:tcPr>
+          <w:p>
+            <w:r>
+              <w:t>- Руководитель проекта - 0,25 чел.</w:t>
+              <w:br/>
+              <w:t>- Бизнес-аналитик - 0,5 чел.</w:t>
+            </w:r>
+          </w:p>
+        </w:tc>
+        <w:tc>
+          <w:tcPr>
+            <w:tcW w:type="dxa" w:w="2339"/>
+          </w:tcPr>
+          <w:p>
+            <w:r>
+              <w:t>Презентация обучения, инструкции пользователя, методические материалы.</w:t>
+            </w:r>
+          </w:p>
+        </w:tc>
+        <w:tc>
+          <w:tcPr>
+            <w:tcW w:type="dxa" w:w="2339"/>
+          </w:tcPr>
+          <w:p>
+            <w:r>
+              <w:t>14 тыс. руб.</w:t>
+            </w:r>
+          </w:p>
+        </w:tc>
+      </w:tr>
+      <w:tr>
+        <w:tc>
+          <w:tcPr>
+            <w:tcW w:type="dxa" w:w="2339"/>
+          </w:tcPr>
+          <w:p>
+            <w:r>
+              <w:t>6.4</w:t>
+            </w:r>
+          </w:p>
+        </w:tc>
+        <w:tc>
+          <w:tcPr>
+            <w:tcW w:type="dxa" w:w="2339"/>
+          </w:tcPr>
+          <w:p>
+            <w:r>
+              <w:t>- Руководитель проекта - 0,5 чел.</w:t>
+              <w:br/>
+              <w:t>- Специалист поддержки - 0,5 чел.</w:t>
+              <w:br/>
+              <w:t>- Разработчик - 0,25 чел.</w:t>
+            </w:r>
+          </w:p>
+        </w:tc>
+        <w:tc>
+          <w:tcPr>
+            <w:tcW w:type="dxa" w:w="2339"/>
+          </w:tcPr>
+          <w:p>
+            <w:r>
+              <w:t>Пилотный контур, журнал замечаний, канал оперативной поддержки.</w:t>
+            </w:r>
+          </w:p>
+        </w:tc>
+        <w:tc>
+          <w:tcPr>
+            <w:tcW w:type="dxa" w:w="2339"/>
+          </w:tcPr>
+          <w:p>
+            <w:r>
+              <w:t>24 тыс. руб.</w:t>
+            </w:r>
+          </w:p>
+        </w:tc>
+      </w:tr>
+      <w:tr>
+        <w:tc>
+          <w:tcPr>
+            <w:tcW w:type="dxa" w:w="2339"/>
+          </w:tcPr>
+          <w:p>
+            <w:r>
+              <w:t>7.1</w:t>
+            </w:r>
+          </w:p>
+        </w:tc>
+        <w:tc>
+          <w:tcPr>
+            <w:tcW w:type="dxa" w:w="2339"/>
+          </w:tcPr>
+          <w:p>
+            <w:r>
+              <w:t>- Представитель заказчика - 0,25 чел.</w:t>
+              <w:br/>
+              <w:t>- Руководитель проекта - 0,25 чел.</w:t>
+              <w:br/>
+              <w:t>- Тестировщик - 0,25 чел.</w:t>
+            </w:r>
+          </w:p>
+        </w:tc>
+        <w:tc>
+          <w:tcPr>
+            <w:tcW w:type="dxa" w:w="2339"/>
+          </w:tcPr>
+          <w:p>
+            <w:r>
+              <w:t>Протоколы испытаний, приемочные листы, комплект отчетных форм.</w:t>
+            </w:r>
+          </w:p>
+        </w:tc>
+        <w:tc>
+          <w:tcPr>
+            <w:tcW w:type="dxa" w:w="2339"/>
+          </w:tcPr>
+          <w:p>
+            <w:r>
+              <w:t>8 тыс. руб.</w:t>
+            </w:r>
+          </w:p>
+        </w:tc>
+      </w:tr>
+      <w:tr>
+        <w:tc>
+          <w:tcPr>
+            <w:tcW w:type="dxa" w:w="2339"/>
+          </w:tcPr>
+          <w:p>
+            <w:r>
+              <w:t>7.2</w:t>
+            </w:r>
+          </w:p>
+        </w:tc>
+        <w:tc>
+          <w:tcPr>
+            <w:tcW w:type="dxa" w:w="2339"/>
+          </w:tcPr>
+          <w:p>
+            <w:r>
+              <w:t>- DevOps-инженер - 0,5 чел.</w:t>
+              <w:br/>
+              <w:t>- Руководитель проекта - 0,25 чел.</w:t>
+            </w:r>
+          </w:p>
+        </w:tc>
+        <w:tc>
+          <w:tcPr>
+            <w:tcW w:type="dxa" w:w="2339"/>
+          </w:tcPr>
+          <w:p>
+            <w:r>
+              <w:t>Релизный пакет, чек-лист публикации, эксплуатационная инструкция.</w:t>
+            </w:r>
+          </w:p>
+        </w:tc>
+        <w:tc>
+          <w:tcPr>
+            <w:tcW w:type="dxa" w:w="2339"/>
+          </w:tcPr>
+          <w:p>
+            <w:r>
+              <w:t>10 тыс. руб.</w:t>
+            </w:r>
+          </w:p>
+        </w:tc>
+      </w:tr>
+      <w:tr>
+        <w:tc>
+          <w:tcPr>
+            <w:tcW w:type="dxa" w:w="2339"/>
+          </w:tcPr>
+          <w:p>
+            <w:r>
+              <w:t>7.3</w:t>
+            </w:r>
+          </w:p>
+        </w:tc>
+        <w:tc>
+          <w:tcPr>
+            <w:tcW w:type="dxa" w:w="2339"/>
+          </w:tcPr>
+          <w:p>
+            <w:r>
+              <w:t>- Руководитель проекта - 0,25 чел.</w:t>
+              <w:br/>
+              <w:t>- Специалист сопровождения - 0,25 чел.</w:t>
+            </w:r>
+          </w:p>
+        </w:tc>
+        <w:tc>
+          <w:tcPr>
+            <w:tcW w:type="dxa" w:w="2339"/>
+          </w:tcPr>
+          <w:p>
+            <w:r>
+              <w:t>Акт передачи, регламент сопровождения, архив проектной документации.</w:t>
+            </w:r>
+          </w:p>
+        </w:tc>
+        <w:tc>
+          <w:tcPr>
+            <w:tcW w:type="dxa" w:w="2339"/>
+          </w:tcPr>
+          <w:p>
+            <w:r>
+              <w:t>8 тыс. руб.</w:t>
+            </w:r>
+          </w:p>
+        </w:tc>
+      </w:tr>
+    </w:tbl>
     <w:sectPr>
       <w:pgSz w:w="11906" w:h="16838"/>
       <w:pgMar w:top="1134" w:right="850" w:bottom="1134" w:left="1701" w:header="708" w:footer="708" w:gutter="0"/>

</xml_diff>

<commit_message>
Update PR3 time estimate table format
Co-authored-by: alexproxor <alexproxor@users.noreply.github.com>
</commit_message>
<xml_diff>
--- a/Прохоров.А.Ф_ПР3.docx
+++ b/Прохоров.А.Ф_ПР3.docx
@@ -4022,6 +4022,11 @@
           <w:szCs w:val="28"/>
         </w:rPr>
       </w:pPr>
+    </w:p>
+    <w:p>
+      <w:r>
+        <w:br w:type="page"/>
+      </w:r>
     </w:p>
     <w:p>
       <w:r>
@@ -5277,7 +5282,7 @@
     </w:p>
     <w:p>
       <w:r>
-        <w:t>Для оценки продолжительности работ использован метод оценки по аналогам. В качестве экспертов необходимо указать не менее трех студентов группы.</w:t>
+        <w:t>Для оценки продолжительности работ использован метод экспертной оценки по трем точкам. В таблице 4.4 приведены оценки трех экспертов и средняя оценка по каждой работе.</w:t>
       </w:r>
     </w:p>
     <w:p>
@@ -5318,15 +5323,16 @@
         <w:tblLook w:firstColumn="1" w:firstRow="1" w:lastColumn="0" w:lastRow="0" w:noHBand="0" w:noVBand="1" w:val="04A0"/>
       </w:tblPr>
       <w:tblGrid>
-        <w:gridCol w:w="2339"/>
-        <w:gridCol w:w="2339"/>
-        <w:gridCol w:w="2339"/>
-        <w:gridCol w:w="2339"/>
+        <w:gridCol w:w="1871"/>
+        <w:gridCol w:w="1871"/>
+        <w:gridCol w:w="1871"/>
+        <w:gridCol w:w="1871"/>
+        <w:gridCol w:w="1871"/>
       </w:tblGrid>
       <w:tr>
         <w:tc>
           <w:tcPr>
-            <w:tcW w:type="dxa" w:w="2339"/>
+            <w:tcW w:type="dxa" w:w="1871"/>
           </w:tcPr>
           <w:p>
             <w:r>
@@ -5336,39 +5342,49 @@
         </w:tc>
         <w:tc>
           <w:tcPr>
-            <w:tcW w:type="dxa" w:w="2339"/>
-          </w:tcPr>
-          <w:p>
-            <w:r>
-              <w:t>Продолжительность выполнения, ч</w:t>
-            </w:r>
-          </w:p>
-        </w:tc>
-        <w:tc>
-          <w:tcPr>
-            <w:tcW w:type="dxa" w:w="2339"/>
-          </w:tcPr>
-          <w:p>
-            <w:r>
-              <w:t>Номер работы</w:t>
-            </w:r>
-          </w:p>
-        </w:tc>
-        <w:tc>
-          <w:tcPr>
-            <w:tcW w:type="dxa" w:w="2339"/>
-          </w:tcPr>
-          <w:p>
-            <w:r>
-              <w:t>Продолжительность выполнения, ч</w:t>
-            </w:r>
-          </w:p>
-        </w:tc>
-      </w:tr>
-      <w:tr>
-        <w:tc>
-          <w:tcPr>
-            <w:tcW w:type="dxa" w:w="2339"/>
+            <w:tcW w:type="dxa" w:w="1871"/>
+          </w:tcPr>
+          <w:p>
+            <w:r>
+              <w:t>Оценка 1</w:t>
+            </w:r>
+          </w:p>
+        </w:tc>
+        <w:tc>
+          <w:tcPr>
+            <w:tcW w:type="dxa" w:w="1871"/>
+          </w:tcPr>
+          <w:p>
+            <w:r>
+              <w:t>Оценка 2</w:t>
+            </w:r>
+          </w:p>
+        </w:tc>
+        <w:tc>
+          <w:tcPr>
+            <w:tcW w:type="dxa" w:w="1871"/>
+          </w:tcPr>
+          <w:p>
+            <w:r>
+              <w:t>Оценка 3</w:t>
+            </w:r>
+          </w:p>
+        </w:tc>
+        <w:tc>
+          <w:tcPr>
+            <w:tcW w:type="dxa" w:w="1871"/>
+          </w:tcPr>
+          <w:p>
+            <w:r>
+              <w:t>Средняя оценка</w:t>
+            </w:r>
+          </w:p>
+        </w:tc>
+      </w:tr>
+      <w:tr>
+        <w:tc>
+          <w:tcPr>
+            <w:tcW w:type="dxa" w:w="1871"/>
           </w:tcPr>
           <w:p>
             <w:r>
@@ -5378,7 +5394,17 @@
         </w:tc>
         <w:tc>
           <w:tcPr>
-            <w:tcW w:type="dxa" w:w="2339"/>
+            <w:tcW w:type="dxa" w:w="1871"/>
+          </w:tcPr>
+          <w:p>
+            <w:r>
+              <w:t>14</w:t>
+            </w:r>
+          </w:p>
+        </w:tc>
+        <w:tc>
+          <w:tcPr>
+            <w:tcW w:type="dxa" w:w="1871"/>
           </w:tcPr>
           <w:p>
             <w:r>
@@ -5388,7 +5414,653 @@
         </w:tc>
         <w:tc>
           <w:tcPr>
-            <w:tcW w:type="dxa" w:w="2339"/>
+            <w:tcW w:type="dxa" w:w="1871"/>
+          </w:tcPr>
+          <w:p>
+            <w:r>
+              <w:t>18</w:t>
+            </w:r>
+          </w:p>
+        </w:tc>
+        <w:tc>
+          <w:tcPr>
+            <w:tcW w:type="dxa" w:w="1871"/>
+          </w:tcPr>
+          <w:p>
+            <w:r>
+              <w:t>16</w:t>
+            </w:r>
+          </w:p>
+        </w:tc>
+      </w:tr>
+      <w:tr>
+        <w:tc>
+          <w:tcPr>
+            <w:tcW w:type="dxa" w:w="1871"/>
+          </w:tcPr>
+          <w:p>
+            <w:r>
+              <w:t>1.2</w:t>
+            </w:r>
+          </w:p>
+        </w:tc>
+        <w:tc>
+          <w:tcPr>
+            <w:tcW w:type="dxa" w:w="1871"/>
+          </w:tcPr>
+          <w:p>
+            <w:r>
+              <w:t>22</w:t>
+            </w:r>
+          </w:p>
+        </w:tc>
+        <w:tc>
+          <w:tcPr>
+            <w:tcW w:type="dxa" w:w="1871"/>
+          </w:tcPr>
+          <w:p>
+            <w:r>
+              <w:t>24</w:t>
+            </w:r>
+          </w:p>
+        </w:tc>
+        <w:tc>
+          <w:tcPr>
+            <w:tcW w:type="dxa" w:w="1871"/>
+          </w:tcPr>
+          <w:p>
+            <w:r>
+              <w:t>26</w:t>
+            </w:r>
+          </w:p>
+        </w:tc>
+        <w:tc>
+          <w:tcPr>
+            <w:tcW w:type="dxa" w:w="1871"/>
+          </w:tcPr>
+          <w:p>
+            <w:r>
+              <w:t>24</w:t>
+            </w:r>
+          </w:p>
+        </w:tc>
+      </w:tr>
+      <w:tr>
+        <w:tc>
+          <w:tcPr>
+            <w:tcW w:type="dxa" w:w="1871"/>
+          </w:tcPr>
+          <w:p>
+            <w:r>
+              <w:t>1.3</w:t>
+            </w:r>
+          </w:p>
+        </w:tc>
+        <w:tc>
+          <w:tcPr>
+            <w:tcW w:type="dxa" w:w="1871"/>
+          </w:tcPr>
+          <w:p>
+            <w:r>
+              <w:t>28</w:t>
+            </w:r>
+          </w:p>
+        </w:tc>
+        <w:tc>
+          <w:tcPr>
+            <w:tcW w:type="dxa" w:w="1871"/>
+          </w:tcPr>
+          <w:p>
+            <w:r>
+              <w:t>32</w:t>
+            </w:r>
+          </w:p>
+        </w:tc>
+        <w:tc>
+          <w:tcPr>
+            <w:tcW w:type="dxa" w:w="1871"/>
+          </w:tcPr>
+          <w:p>
+            <w:r>
+              <w:t>36</w:t>
+            </w:r>
+          </w:p>
+        </w:tc>
+        <w:tc>
+          <w:tcPr>
+            <w:tcW w:type="dxa" w:w="1871"/>
+          </w:tcPr>
+          <w:p>
+            <w:r>
+              <w:t>32</w:t>
+            </w:r>
+          </w:p>
+        </w:tc>
+      </w:tr>
+      <w:tr>
+        <w:tc>
+          <w:tcPr>
+            <w:tcW w:type="dxa" w:w="1871"/>
+          </w:tcPr>
+          <w:p>
+            <w:r>
+              <w:t>2.1</w:t>
+            </w:r>
+          </w:p>
+        </w:tc>
+        <w:tc>
+          <w:tcPr>
+            <w:tcW w:type="dxa" w:w="1871"/>
+          </w:tcPr>
+          <w:p>
+            <w:r>
+              <w:t>22</w:t>
+            </w:r>
+          </w:p>
+        </w:tc>
+        <w:tc>
+          <w:tcPr>
+            <w:tcW w:type="dxa" w:w="1871"/>
+          </w:tcPr>
+          <w:p>
+            <w:r>
+              <w:t>24</w:t>
+            </w:r>
+          </w:p>
+        </w:tc>
+        <w:tc>
+          <w:tcPr>
+            <w:tcW w:type="dxa" w:w="1871"/>
+          </w:tcPr>
+          <w:p>
+            <w:r>
+              <w:t>26</w:t>
+            </w:r>
+          </w:p>
+        </w:tc>
+        <w:tc>
+          <w:tcPr>
+            <w:tcW w:type="dxa" w:w="1871"/>
+          </w:tcPr>
+          <w:p>
+            <w:r>
+              <w:t>24</w:t>
+            </w:r>
+          </w:p>
+        </w:tc>
+      </w:tr>
+      <w:tr>
+        <w:tc>
+          <w:tcPr>
+            <w:tcW w:type="dxa" w:w="1871"/>
+          </w:tcPr>
+          <w:p>
+            <w:r>
+              <w:t>2.2</w:t>
+            </w:r>
+          </w:p>
+        </w:tc>
+        <w:tc>
+          <w:tcPr>
+            <w:tcW w:type="dxa" w:w="1871"/>
+          </w:tcPr>
+          <w:p>
+            <w:r>
+              <w:t>14</w:t>
+            </w:r>
+          </w:p>
+        </w:tc>
+        <w:tc>
+          <w:tcPr>
+            <w:tcW w:type="dxa" w:w="1871"/>
+          </w:tcPr>
+          <w:p>
+            <w:r>
+              <w:t>16</w:t>
+            </w:r>
+          </w:p>
+        </w:tc>
+        <w:tc>
+          <w:tcPr>
+            <w:tcW w:type="dxa" w:w="1871"/>
+          </w:tcPr>
+          <w:p>
+            <w:r>
+              <w:t>18</w:t>
+            </w:r>
+          </w:p>
+        </w:tc>
+        <w:tc>
+          <w:tcPr>
+            <w:tcW w:type="dxa" w:w="1871"/>
+          </w:tcPr>
+          <w:p>
+            <w:r>
+              <w:t>16</w:t>
+            </w:r>
+          </w:p>
+        </w:tc>
+      </w:tr>
+      <w:tr>
+        <w:tc>
+          <w:tcPr>
+            <w:tcW w:type="dxa" w:w="1871"/>
+          </w:tcPr>
+          <w:p>
+            <w:r>
+              <w:t>2.3</w:t>
+            </w:r>
+          </w:p>
+        </w:tc>
+        <w:tc>
+          <w:tcPr>
+            <w:tcW w:type="dxa" w:w="1871"/>
+          </w:tcPr>
+          <w:p>
+            <w:r>
+              <w:t>14</w:t>
+            </w:r>
+          </w:p>
+        </w:tc>
+        <w:tc>
+          <w:tcPr>
+            <w:tcW w:type="dxa" w:w="1871"/>
+          </w:tcPr>
+          <w:p>
+            <w:r>
+              <w:t>16</w:t>
+            </w:r>
+          </w:p>
+        </w:tc>
+        <w:tc>
+          <w:tcPr>
+            <w:tcW w:type="dxa" w:w="1871"/>
+          </w:tcPr>
+          <w:p>
+            <w:r>
+              <w:t>18</w:t>
+            </w:r>
+          </w:p>
+        </w:tc>
+        <w:tc>
+          <w:tcPr>
+            <w:tcW w:type="dxa" w:w="1871"/>
+          </w:tcPr>
+          <w:p>
+            <w:r>
+              <w:t>16</w:t>
+            </w:r>
+          </w:p>
+        </w:tc>
+      </w:tr>
+      <w:tr>
+        <w:tc>
+          <w:tcPr>
+            <w:tcW w:type="dxa" w:w="1871"/>
+          </w:tcPr>
+          <w:p>
+            <w:r>
+              <w:t>3.1</w:t>
+            </w:r>
+          </w:p>
+        </w:tc>
+        <w:tc>
+          <w:tcPr>
+            <w:tcW w:type="dxa" w:w="1871"/>
+          </w:tcPr>
+          <w:p>
+            <w:r>
+              <w:t>22</w:t>
+            </w:r>
+          </w:p>
+        </w:tc>
+        <w:tc>
+          <w:tcPr>
+            <w:tcW w:type="dxa" w:w="1871"/>
+          </w:tcPr>
+          <w:p>
+            <w:r>
+              <w:t>24</w:t>
+            </w:r>
+          </w:p>
+        </w:tc>
+        <w:tc>
+          <w:tcPr>
+            <w:tcW w:type="dxa" w:w="1871"/>
+          </w:tcPr>
+          <w:p>
+            <w:r>
+              <w:t>26</w:t>
+            </w:r>
+          </w:p>
+        </w:tc>
+        <w:tc>
+          <w:tcPr>
+            <w:tcW w:type="dxa" w:w="1871"/>
+          </w:tcPr>
+          <w:p>
+            <w:r>
+              <w:t>24</w:t>
+            </w:r>
+          </w:p>
+        </w:tc>
+      </w:tr>
+      <w:tr>
+        <w:tc>
+          <w:tcPr>
+            <w:tcW w:type="dxa" w:w="1871"/>
+          </w:tcPr>
+          <w:p>
+            <w:r>
+              <w:t>3.2</w:t>
+            </w:r>
+          </w:p>
+        </w:tc>
+        <w:tc>
+          <w:tcPr>
+            <w:tcW w:type="dxa" w:w="1871"/>
+          </w:tcPr>
+          <w:p>
+            <w:r>
+              <w:t>14</w:t>
+            </w:r>
+          </w:p>
+        </w:tc>
+        <w:tc>
+          <w:tcPr>
+            <w:tcW w:type="dxa" w:w="1871"/>
+          </w:tcPr>
+          <w:p>
+            <w:r>
+              <w:t>16</w:t>
+            </w:r>
+          </w:p>
+        </w:tc>
+        <w:tc>
+          <w:tcPr>
+            <w:tcW w:type="dxa" w:w="1871"/>
+          </w:tcPr>
+          <w:p>
+            <w:r>
+              <w:t>18</w:t>
+            </w:r>
+          </w:p>
+        </w:tc>
+        <w:tc>
+          <w:tcPr>
+            <w:tcW w:type="dxa" w:w="1871"/>
+          </w:tcPr>
+          <w:p>
+            <w:r>
+              <w:t>16</w:t>
+            </w:r>
+          </w:p>
+        </w:tc>
+      </w:tr>
+      <w:tr>
+        <w:tc>
+          <w:tcPr>
+            <w:tcW w:type="dxa" w:w="1871"/>
+          </w:tcPr>
+          <w:p>
+            <w:r>
+              <w:t>3.3</w:t>
+            </w:r>
+          </w:p>
+        </w:tc>
+        <w:tc>
+          <w:tcPr>
+            <w:tcW w:type="dxa" w:w="1871"/>
+          </w:tcPr>
+          <w:p>
+            <w:r>
+              <w:t>14</w:t>
+            </w:r>
+          </w:p>
+        </w:tc>
+        <w:tc>
+          <w:tcPr>
+            <w:tcW w:type="dxa" w:w="1871"/>
+          </w:tcPr>
+          <w:p>
+            <w:r>
+              <w:t>16</w:t>
+            </w:r>
+          </w:p>
+        </w:tc>
+        <w:tc>
+          <w:tcPr>
+            <w:tcW w:type="dxa" w:w="1871"/>
+          </w:tcPr>
+          <w:p>
+            <w:r>
+              <w:t>18</w:t>
+            </w:r>
+          </w:p>
+        </w:tc>
+        <w:tc>
+          <w:tcPr>
+            <w:tcW w:type="dxa" w:w="1871"/>
+          </w:tcPr>
+          <w:p>
+            <w:r>
+              <w:t>16</w:t>
+            </w:r>
+          </w:p>
+        </w:tc>
+      </w:tr>
+      <w:tr>
+        <w:tc>
+          <w:tcPr>
+            <w:tcW w:type="dxa" w:w="1871"/>
+          </w:tcPr>
+          <w:p>
+            <w:r>
+              <w:t>3.4</w:t>
+            </w:r>
+          </w:p>
+        </w:tc>
+        <w:tc>
+          <w:tcPr>
+            <w:tcW w:type="dxa" w:w="1871"/>
+          </w:tcPr>
+          <w:p>
+            <w:r>
+              <w:t>14</w:t>
+            </w:r>
+          </w:p>
+        </w:tc>
+        <w:tc>
+          <w:tcPr>
+            <w:tcW w:type="dxa" w:w="1871"/>
+          </w:tcPr>
+          <w:p>
+            <w:r>
+              <w:t>16</w:t>
+            </w:r>
+          </w:p>
+        </w:tc>
+        <w:tc>
+          <w:tcPr>
+            <w:tcW w:type="dxa" w:w="1871"/>
+          </w:tcPr>
+          <w:p>
+            <w:r>
+              <w:t>18</w:t>
+            </w:r>
+          </w:p>
+        </w:tc>
+        <w:tc>
+          <w:tcPr>
+            <w:tcW w:type="dxa" w:w="1871"/>
+          </w:tcPr>
+          <w:p>
+            <w:r>
+              <w:t>16</w:t>
+            </w:r>
+          </w:p>
+        </w:tc>
+      </w:tr>
+      <w:tr>
+        <w:tc>
+          <w:tcPr>
+            <w:tcW w:type="dxa" w:w="1871"/>
+          </w:tcPr>
+          <w:p>
+            <w:r>
+              <w:t>4.1</w:t>
+            </w:r>
+          </w:p>
+        </w:tc>
+        <w:tc>
+          <w:tcPr>
+            <w:tcW w:type="dxa" w:w="1871"/>
+          </w:tcPr>
+          <w:p>
+            <w:r>
+              <w:t>60</w:t>
+            </w:r>
+          </w:p>
+        </w:tc>
+        <w:tc>
+          <w:tcPr>
+            <w:tcW w:type="dxa" w:w="1871"/>
+          </w:tcPr>
+          <w:p>
+            <w:r>
+              <w:t>64</w:t>
+            </w:r>
+          </w:p>
+        </w:tc>
+        <w:tc>
+          <w:tcPr>
+            <w:tcW w:type="dxa" w:w="1871"/>
+          </w:tcPr>
+          <w:p>
+            <w:r>
+              <w:t>68</w:t>
+            </w:r>
+          </w:p>
+        </w:tc>
+        <w:tc>
+          <w:tcPr>
+            <w:tcW w:type="dxa" w:w="1871"/>
+          </w:tcPr>
+          <w:p>
+            <w:r>
+              <w:t>64</w:t>
+            </w:r>
+          </w:p>
+        </w:tc>
+      </w:tr>
+      <w:tr>
+        <w:tc>
+          <w:tcPr>
+            <w:tcW w:type="dxa" w:w="1871"/>
+          </w:tcPr>
+          <w:p>
+            <w:r>
+              <w:t>4.2</w:t>
+            </w:r>
+          </w:p>
+        </w:tc>
+        <w:tc>
+          <w:tcPr>
+            <w:tcW w:type="dxa" w:w="1871"/>
+          </w:tcPr>
+          <w:p>
+            <w:r>
+              <w:t>52</w:t>
+            </w:r>
+          </w:p>
+        </w:tc>
+        <w:tc>
+          <w:tcPr>
+            <w:tcW w:type="dxa" w:w="1871"/>
+          </w:tcPr>
+          <w:p>
+            <w:r>
+              <w:t>56</w:t>
+            </w:r>
+          </w:p>
+        </w:tc>
+        <w:tc>
+          <w:tcPr>
+            <w:tcW w:type="dxa" w:w="1871"/>
+          </w:tcPr>
+          <w:p>
+            <w:r>
+              <w:t>60</w:t>
+            </w:r>
+          </w:p>
+        </w:tc>
+        <w:tc>
+          <w:tcPr>
+            <w:tcW w:type="dxa" w:w="1871"/>
+          </w:tcPr>
+          <w:p>
+            <w:r>
+              <w:t>56</w:t>
+            </w:r>
+          </w:p>
+        </w:tc>
+      </w:tr>
+      <w:tr>
+        <w:tc>
+          <w:tcPr>
+            <w:tcW w:type="dxa" w:w="1871"/>
+          </w:tcPr>
+          <w:p>
+            <w:r>
+              <w:t>4.3</w:t>
+            </w:r>
+          </w:p>
+        </w:tc>
+        <w:tc>
+          <w:tcPr>
+            <w:tcW w:type="dxa" w:w="1871"/>
+          </w:tcPr>
+          <w:p>
+            <w:r>
+              <w:t>52</w:t>
+            </w:r>
+          </w:p>
+        </w:tc>
+        <w:tc>
+          <w:tcPr>
+            <w:tcW w:type="dxa" w:w="1871"/>
+          </w:tcPr>
+          <w:p>
+            <w:r>
+              <w:t>56</w:t>
+            </w:r>
+          </w:p>
+        </w:tc>
+        <w:tc>
+          <w:tcPr>
+            <w:tcW w:type="dxa" w:w="1871"/>
+          </w:tcPr>
+          <w:p>
+            <w:r>
+              <w:t>60</w:t>
+            </w:r>
+          </w:p>
+        </w:tc>
+        <w:tc>
+          <w:tcPr>
+            <w:tcW w:type="dxa" w:w="1871"/>
+          </w:tcPr>
+          <w:p>
+            <w:r>
+              <w:t>56</w:t>
+            </w:r>
+          </w:p>
+        </w:tc>
+      </w:tr>
+      <w:tr>
+        <w:tc>
+          <w:tcPr>
+            <w:tcW w:type="dxa" w:w="1871"/>
           </w:tcPr>
           <w:p>
             <w:r>
@@ -5398,7 +6070,17 @@
         </w:tc>
         <w:tc>
           <w:tcPr>
-            <w:tcW w:type="dxa" w:w="2339"/>
+            <w:tcW w:type="dxa" w:w="1871"/>
+          </w:tcPr>
+          <w:p>
+            <w:r>
+              <w:t>22</w:t>
+            </w:r>
+          </w:p>
+        </w:tc>
+        <w:tc>
+          <w:tcPr>
+            <w:tcW w:type="dxa" w:w="1871"/>
           </w:tcPr>
           <w:p>
             <w:r>
@@ -5406,21 +6088,19 @@
             </w:r>
           </w:p>
         </w:tc>
-      </w:tr>
-      <w:tr>
-        <w:tc>
-          <w:tcPr>
-            <w:tcW w:type="dxa" w:w="2339"/>
-          </w:tcPr>
-          <w:p>
-            <w:r>
-              <w:t>1.2</w:t>
-            </w:r>
-          </w:p>
-        </w:tc>
-        <w:tc>
-          <w:tcPr>
-            <w:tcW w:type="dxa" w:w="2339"/>
+        <w:tc>
+          <w:tcPr>
+            <w:tcW w:type="dxa" w:w="1871"/>
+          </w:tcPr>
+          <w:p>
+            <w:r>
+              <w:t>26</w:t>
+            </w:r>
+          </w:p>
+        </w:tc>
+        <w:tc>
+          <w:tcPr>
+            <w:tcW w:type="dxa" w:w="1871"/>
           </w:tcPr>
           <w:p>
             <w:r>
@@ -5428,9 +6108,11 @@
             </w:r>
           </w:p>
         </w:tc>
-        <w:tc>
-          <w:tcPr>
-            <w:tcW w:type="dxa" w:w="2339"/>
+      </w:tr>
+      <w:tr>
+        <w:tc>
+          <w:tcPr>
+            <w:tcW w:type="dxa" w:w="1871"/>
           </w:tcPr>
           <w:p>
             <w:r>
@@ -5440,7 +6122,17 @@
         </w:tc>
         <w:tc>
           <w:tcPr>
-            <w:tcW w:type="dxa" w:w="2339"/>
+            <w:tcW w:type="dxa" w:w="1871"/>
+          </w:tcPr>
+          <w:p>
+            <w:r>
+              <w:t>36</w:t>
+            </w:r>
+          </w:p>
+        </w:tc>
+        <w:tc>
+          <w:tcPr>
+            <w:tcW w:type="dxa" w:w="1871"/>
           </w:tcPr>
           <w:p>
             <w:r>
@@ -5448,31 +6140,31 @@
             </w:r>
           </w:p>
         </w:tc>
-      </w:tr>
-      <w:tr>
-        <w:tc>
-          <w:tcPr>
-            <w:tcW w:type="dxa" w:w="2339"/>
-          </w:tcPr>
-          <w:p>
-            <w:r>
-              <w:t>1.3</w:t>
-            </w:r>
-          </w:p>
-        </w:tc>
-        <w:tc>
-          <w:tcPr>
-            <w:tcW w:type="dxa" w:w="2339"/>
-          </w:tcPr>
-          <w:p>
-            <w:r>
-              <w:t>32</w:t>
-            </w:r>
-          </w:p>
-        </w:tc>
-        <w:tc>
-          <w:tcPr>
-            <w:tcW w:type="dxa" w:w="2339"/>
+        <w:tc>
+          <w:tcPr>
+            <w:tcW w:type="dxa" w:w="1871"/>
+          </w:tcPr>
+          <w:p>
+            <w:r>
+              <w:t>44</w:t>
+            </w:r>
+          </w:p>
+        </w:tc>
+        <w:tc>
+          <w:tcPr>
+            <w:tcW w:type="dxa" w:w="1871"/>
+          </w:tcPr>
+          <w:p>
+            <w:r>
+              <w:t>40</w:t>
+            </w:r>
+          </w:p>
+        </w:tc>
+      </w:tr>
+      <w:tr>
+        <w:tc>
+          <w:tcPr>
+            <w:tcW w:type="dxa" w:w="1871"/>
           </w:tcPr>
           <w:p>
             <w:r>
@@ -5482,7 +6174,17 @@
         </w:tc>
         <w:tc>
           <w:tcPr>
-            <w:tcW w:type="dxa" w:w="2339"/>
+            <w:tcW w:type="dxa" w:w="1871"/>
+          </w:tcPr>
+          <w:p>
+            <w:r>
+              <w:t>14</w:t>
+            </w:r>
+          </w:p>
+        </w:tc>
+        <w:tc>
+          <w:tcPr>
+            <w:tcW w:type="dxa" w:w="1871"/>
           </w:tcPr>
           <w:p>
             <w:r>
@@ -5490,21 +6192,155 @@
             </w:r>
           </w:p>
         </w:tc>
-      </w:tr>
-      <w:tr>
-        <w:tc>
-          <w:tcPr>
-            <w:tcW w:type="dxa" w:w="2339"/>
-          </w:tcPr>
-          <w:p>
-            <w:r>
-              <w:t>2.1</w:t>
-            </w:r>
-          </w:p>
-        </w:tc>
-        <w:tc>
-          <w:tcPr>
-            <w:tcW w:type="dxa" w:w="2339"/>
+        <w:tc>
+          <w:tcPr>
+            <w:tcW w:type="dxa" w:w="1871"/>
+          </w:tcPr>
+          <w:p>
+            <w:r>
+              <w:t>18</w:t>
+            </w:r>
+          </w:p>
+        </w:tc>
+        <w:tc>
+          <w:tcPr>
+            <w:tcW w:type="dxa" w:w="1871"/>
+          </w:tcPr>
+          <w:p>
+            <w:r>
+              <w:t>16</w:t>
+            </w:r>
+          </w:p>
+        </w:tc>
+      </w:tr>
+      <w:tr>
+        <w:tc>
+          <w:tcPr>
+            <w:tcW w:type="dxa" w:w="1871"/>
+          </w:tcPr>
+          <w:p>
+            <w:r>
+              <w:t>5.2</w:t>
+            </w:r>
+          </w:p>
+        </w:tc>
+        <w:tc>
+          <w:tcPr>
+            <w:tcW w:type="dxa" w:w="1871"/>
+          </w:tcPr>
+          <w:p>
+            <w:r>
+              <w:t>36</w:t>
+            </w:r>
+          </w:p>
+        </w:tc>
+        <w:tc>
+          <w:tcPr>
+            <w:tcW w:type="dxa" w:w="1871"/>
+          </w:tcPr>
+          <w:p>
+            <w:r>
+              <w:t>40</w:t>
+            </w:r>
+          </w:p>
+        </w:tc>
+        <w:tc>
+          <w:tcPr>
+            <w:tcW w:type="dxa" w:w="1871"/>
+          </w:tcPr>
+          <w:p>
+            <w:r>
+              <w:t>44</w:t>
+            </w:r>
+          </w:p>
+        </w:tc>
+        <w:tc>
+          <w:tcPr>
+            <w:tcW w:type="dxa" w:w="1871"/>
+          </w:tcPr>
+          <w:p>
+            <w:r>
+              <w:t>40</w:t>
+            </w:r>
+          </w:p>
+        </w:tc>
+      </w:tr>
+      <w:tr>
+        <w:tc>
+          <w:tcPr>
+            <w:tcW w:type="dxa" w:w="1871"/>
+          </w:tcPr>
+          <w:p>
+            <w:r>
+              <w:t>5.3</w:t>
+            </w:r>
+          </w:p>
+        </w:tc>
+        <w:tc>
+          <w:tcPr>
+            <w:tcW w:type="dxa" w:w="1871"/>
+          </w:tcPr>
+          <w:p>
+            <w:r>
+              <w:t>14</w:t>
+            </w:r>
+          </w:p>
+        </w:tc>
+        <w:tc>
+          <w:tcPr>
+            <w:tcW w:type="dxa" w:w="1871"/>
+          </w:tcPr>
+          <w:p>
+            <w:r>
+              <w:t>16</w:t>
+            </w:r>
+          </w:p>
+        </w:tc>
+        <w:tc>
+          <w:tcPr>
+            <w:tcW w:type="dxa" w:w="1871"/>
+          </w:tcPr>
+          <w:p>
+            <w:r>
+              <w:t>18</w:t>
+            </w:r>
+          </w:p>
+        </w:tc>
+        <w:tc>
+          <w:tcPr>
+            <w:tcW w:type="dxa" w:w="1871"/>
+          </w:tcPr>
+          <w:p>
+            <w:r>
+              <w:t>16</w:t>
+            </w:r>
+          </w:p>
+        </w:tc>
+      </w:tr>
+      <w:tr>
+        <w:tc>
+          <w:tcPr>
+            <w:tcW w:type="dxa" w:w="1871"/>
+          </w:tcPr>
+          <w:p>
+            <w:r>
+              <w:t>5.4</w:t>
+            </w:r>
+          </w:p>
+        </w:tc>
+        <w:tc>
+          <w:tcPr>
+            <w:tcW w:type="dxa" w:w="1871"/>
+          </w:tcPr>
+          <w:p>
+            <w:r>
+              <w:t>22</w:t>
+            </w:r>
+          </w:p>
+        </w:tc>
+        <w:tc>
+          <w:tcPr>
+            <w:tcW w:type="dxa" w:w="1871"/>
           </w:tcPr>
           <w:p>
             <w:r>
@@ -5514,39 +6350,49 @@
         </w:tc>
         <w:tc>
           <w:tcPr>
-            <w:tcW w:type="dxa" w:w="2339"/>
-          </w:tcPr>
-          <w:p>
-            <w:r>
-              <w:t>5.2</w:t>
-            </w:r>
-          </w:p>
-        </w:tc>
-        <w:tc>
-          <w:tcPr>
-            <w:tcW w:type="dxa" w:w="2339"/>
-          </w:tcPr>
-          <w:p>
-            <w:r>
-              <w:t>40</w:t>
-            </w:r>
-          </w:p>
-        </w:tc>
-      </w:tr>
-      <w:tr>
-        <w:tc>
-          <w:tcPr>
-            <w:tcW w:type="dxa" w:w="2339"/>
-          </w:tcPr>
-          <w:p>
-            <w:r>
-              <w:t>2.2</w:t>
-            </w:r>
-          </w:p>
-        </w:tc>
-        <w:tc>
-          <w:tcPr>
-            <w:tcW w:type="dxa" w:w="2339"/>
+            <w:tcW w:type="dxa" w:w="1871"/>
+          </w:tcPr>
+          <w:p>
+            <w:r>
+              <w:t>26</w:t>
+            </w:r>
+          </w:p>
+        </w:tc>
+        <w:tc>
+          <w:tcPr>
+            <w:tcW w:type="dxa" w:w="1871"/>
+          </w:tcPr>
+          <w:p>
+            <w:r>
+              <w:t>24</w:t>
+            </w:r>
+          </w:p>
+        </w:tc>
+      </w:tr>
+      <w:tr>
+        <w:tc>
+          <w:tcPr>
+            <w:tcW w:type="dxa" w:w="1871"/>
+          </w:tcPr>
+          <w:p>
+            <w:r>
+              <w:t>6.1</w:t>
+            </w:r>
+          </w:p>
+        </w:tc>
+        <w:tc>
+          <w:tcPr>
+            <w:tcW w:type="dxa" w:w="1871"/>
+          </w:tcPr>
+          <w:p>
+            <w:r>
+              <w:t>14</w:t>
+            </w:r>
+          </w:p>
+        </w:tc>
+        <w:tc>
+          <w:tcPr>
+            <w:tcW w:type="dxa" w:w="1871"/>
           </w:tcPr>
           <w:p>
             <w:r>
@@ -5556,17 +6402,17 @@
         </w:tc>
         <w:tc>
           <w:tcPr>
-            <w:tcW w:type="dxa" w:w="2339"/>
-          </w:tcPr>
-          <w:p>
-            <w:r>
-              <w:t>5.3</w:t>
-            </w:r>
-          </w:p>
-        </w:tc>
-        <w:tc>
-          <w:tcPr>
-            <w:tcW w:type="dxa" w:w="2339"/>
+            <w:tcW w:type="dxa" w:w="1871"/>
+          </w:tcPr>
+          <w:p>
+            <w:r>
+              <w:t>18</w:t>
+            </w:r>
+          </w:p>
+        </w:tc>
+        <w:tc>
+          <w:tcPr>
+            <w:tcW w:type="dxa" w:w="1871"/>
           </w:tcPr>
           <w:p>
             <w:r>
@@ -5578,17 +6424,27 @@
       <w:tr>
         <w:tc>
           <w:tcPr>
-            <w:tcW w:type="dxa" w:w="2339"/>
-          </w:tcPr>
-          <w:p>
-            <w:r>
-              <w:t>2.3</w:t>
-            </w:r>
-          </w:p>
-        </w:tc>
-        <w:tc>
-          <w:tcPr>
-            <w:tcW w:type="dxa" w:w="2339"/>
+            <w:tcW w:type="dxa" w:w="1871"/>
+          </w:tcPr>
+          <w:p>
+            <w:r>
+              <w:t>6.2</w:t>
+            </w:r>
+          </w:p>
+        </w:tc>
+        <w:tc>
+          <w:tcPr>
+            <w:tcW w:type="dxa" w:w="1871"/>
+          </w:tcPr>
+          <w:p>
+            <w:r>
+              <w:t>14</w:t>
+            </w:r>
+          </w:p>
+        </w:tc>
+        <w:tc>
+          <w:tcPr>
+            <w:tcW w:type="dxa" w:w="1871"/>
           </w:tcPr>
           <w:p>
             <w:r>
@@ -5598,17 +6454,101 @@
         </w:tc>
         <w:tc>
           <w:tcPr>
-            <w:tcW w:type="dxa" w:w="2339"/>
-          </w:tcPr>
-          <w:p>
-            <w:r>
-              <w:t>5.4</w:t>
-            </w:r>
-          </w:p>
-        </w:tc>
-        <w:tc>
-          <w:tcPr>
-            <w:tcW w:type="dxa" w:w="2339"/>
+            <w:tcW w:type="dxa" w:w="1871"/>
+          </w:tcPr>
+          <w:p>
+            <w:r>
+              <w:t>18</w:t>
+            </w:r>
+          </w:p>
+        </w:tc>
+        <w:tc>
+          <w:tcPr>
+            <w:tcW w:type="dxa" w:w="1871"/>
+          </w:tcPr>
+          <w:p>
+            <w:r>
+              <w:t>16</w:t>
+            </w:r>
+          </w:p>
+        </w:tc>
+      </w:tr>
+      <w:tr>
+        <w:tc>
+          <w:tcPr>
+            <w:tcW w:type="dxa" w:w="1871"/>
+          </w:tcPr>
+          <w:p>
+            <w:r>
+              <w:t>6.3</w:t>
+            </w:r>
+          </w:p>
+        </w:tc>
+        <w:tc>
+          <w:tcPr>
+            <w:tcW w:type="dxa" w:w="1871"/>
+          </w:tcPr>
+          <w:p>
+            <w:r>
+              <w:t>14</w:t>
+            </w:r>
+          </w:p>
+        </w:tc>
+        <w:tc>
+          <w:tcPr>
+            <w:tcW w:type="dxa" w:w="1871"/>
+          </w:tcPr>
+          <w:p>
+            <w:r>
+              <w:t>16</w:t>
+            </w:r>
+          </w:p>
+        </w:tc>
+        <w:tc>
+          <w:tcPr>
+            <w:tcW w:type="dxa" w:w="1871"/>
+          </w:tcPr>
+          <w:p>
+            <w:r>
+              <w:t>18</w:t>
+            </w:r>
+          </w:p>
+        </w:tc>
+        <w:tc>
+          <w:tcPr>
+            <w:tcW w:type="dxa" w:w="1871"/>
+          </w:tcPr>
+          <w:p>
+            <w:r>
+              <w:t>16</w:t>
+            </w:r>
+          </w:p>
+        </w:tc>
+      </w:tr>
+      <w:tr>
+        <w:tc>
+          <w:tcPr>
+            <w:tcW w:type="dxa" w:w="1871"/>
+          </w:tcPr>
+          <w:p>
+            <w:r>
+              <w:t>6.4</w:t>
+            </w:r>
+          </w:p>
+        </w:tc>
+        <w:tc>
+          <w:tcPr>
+            <w:tcW w:type="dxa" w:w="1871"/>
+          </w:tcPr>
+          <w:p>
+            <w:r>
+              <w:t>22</w:t>
+            </w:r>
+          </w:p>
+        </w:tc>
+        <w:tc>
+          <w:tcPr>
+            <w:tcW w:type="dxa" w:w="1871"/>
           </w:tcPr>
           <w:p>
             <w:r>
@@ -5616,21 +6556,19 @@
             </w:r>
           </w:p>
         </w:tc>
-      </w:tr>
-      <w:tr>
-        <w:tc>
-          <w:tcPr>
-            <w:tcW w:type="dxa" w:w="2339"/>
-          </w:tcPr>
-          <w:p>
-            <w:r>
-              <w:t>3.1</w:t>
-            </w:r>
-          </w:p>
-        </w:tc>
-        <w:tc>
-          <w:tcPr>
-            <w:tcW w:type="dxa" w:w="2339"/>
+        <w:tc>
+          <w:tcPr>
+            <w:tcW w:type="dxa" w:w="1871"/>
+          </w:tcPr>
+          <w:p>
+            <w:r>
+              <w:t>26</w:t>
+            </w:r>
+          </w:p>
+        </w:tc>
+        <w:tc>
+          <w:tcPr>
+            <w:tcW w:type="dxa" w:w="1871"/>
           </w:tcPr>
           <w:p>
             <w:r>
@@ -5638,177 +6576,11 @@
             </w:r>
           </w:p>
         </w:tc>
-        <w:tc>
-          <w:tcPr>
-            <w:tcW w:type="dxa" w:w="2339"/>
-          </w:tcPr>
-          <w:p>
-            <w:r>
-              <w:t>6.1</w:t>
-            </w:r>
-          </w:p>
-        </w:tc>
-        <w:tc>
-          <w:tcPr>
-            <w:tcW w:type="dxa" w:w="2339"/>
-          </w:tcPr>
-          <w:p>
-            <w:r>
-              <w:t>16</w:t>
-            </w:r>
-          </w:p>
-        </w:tc>
-      </w:tr>
-      <w:tr>
-        <w:tc>
-          <w:tcPr>
-            <w:tcW w:type="dxa" w:w="2339"/>
-          </w:tcPr>
-          <w:p>
-            <w:r>
-              <w:t>3.2</w:t>
-            </w:r>
-          </w:p>
-        </w:tc>
-        <w:tc>
-          <w:tcPr>
-            <w:tcW w:type="dxa" w:w="2339"/>
-          </w:tcPr>
-          <w:p>
-            <w:r>
-              <w:t>16</w:t>
-            </w:r>
-          </w:p>
-        </w:tc>
-        <w:tc>
-          <w:tcPr>
-            <w:tcW w:type="dxa" w:w="2339"/>
-          </w:tcPr>
-          <w:p>
-            <w:r>
-              <w:t>6.2</w:t>
-            </w:r>
-          </w:p>
-        </w:tc>
-        <w:tc>
-          <w:tcPr>
-            <w:tcW w:type="dxa" w:w="2339"/>
-          </w:tcPr>
-          <w:p>
-            <w:r>
-              <w:t>16</w:t>
-            </w:r>
-          </w:p>
-        </w:tc>
-      </w:tr>
-      <w:tr>
-        <w:tc>
-          <w:tcPr>
-            <w:tcW w:type="dxa" w:w="2339"/>
-          </w:tcPr>
-          <w:p>
-            <w:r>
-              <w:t>3.3</w:t>
-            </w:r>
-          </w:p>
-        </w:tc>
-        <w:tc>
-          <w:tcPr>
-            <w:tcW w:type="dxa" w:w="2339"/>
-          </w:tcPr>
-          <w:p>
-            <w:r>
-              <w:t>16</w:t>
-            </w:r>
-          </w:p>
-        </w:tc>
-        <w:tc>
-          <w:tcPr>
-            <w:tcW w:type="dxa" w:w="2339"/>
-          </w:tcPr>
-          <w:p>
-            <w:r>
-              <w:t>6.3</w:t>
-            </w:r>
-          </w:p>
-        </w:tc>
-        <w:tc>
-          <w:tcPr>
-            <w:tcW w:type="dxa" w:w="2339"/>
-          </w:tcPr>
-          <w:p>
-            <w:r>
-              <w:t>16</w:t>
-            </w:r>
-          </w:p>
-        </w:tc>
-      </w:tr>
-      <w:tr>
-        <w:tc>
-          <w:tcPr>
-            <w:tcW w:type="dxa" w:w="2339"/>
-          </w:tcPr>
-          <w:p>
-            <w:r>
-              <w:t>3.4</w:t>
-            </w:r>
-          </w:p>
-        </w:tc>
-        <w:tc>
-          <w:tcPr>
-            <w:tcW w:type="dxa" w:w="2339"/>
-          </w:tcPr>
-          <w:p>
-            <w:r>
-              <w:t>16</w:t>
-            </w:r>
-          </w:p>
-        </w:tc>
-        <w:tc>
-          <w:tcPr>
-            <w:tcW w:type="dxa" w:w="2339"/>
-          </w:tcPr>
-          <w:p>
-            <w:r>
-              <w:t>6.4</w:t>
-            </w:r>
-          </w:p>
-        </w:tc>
-        <w:tc>
-          <w:tcPr>
-            <w:tcW w:type="dxa" w:w="2339"/>
-          </w:tcPr>
-          <w:p>
-            <w:r>
-              <w:t>24</w:t>
-            </w:r>
-          </w:p>
-        </w:tc>
-      </w:tr>
-      <w:tr>
-        <w:tc>
-          <w:tcPr>
-            <w:tcW w:type="dxa" w:w="2339"/>
-          </w:tcPr>
-          <w:p>
-            <w:r>
-              <w:t>4.1</w:t>
-            </w:r>
-          </w:p>
-        </w:tc>
-        <w:tc>
-          <w:tcPr>
-            <w:tcW w:type="dxa" w:w="2339"/>
-          </w:tcPr>
-          <w:p>
-            <w:r>
-              <w:t>64</w:t>
-            </w:r>
-          </w:p>
-        </w:tc>
-        <w:tc>
-          <w:tcPr>
-            <w:tcW w:type="dxa" w:w="2339"/>
+      </w:tr>
+      <w:tr>
+        <w:tc>
+          <w:tcPr>
+            <w:tcW w:type="dxa" w:w="1871"/>
           </w:tcPr>
           <w:p>
             <w:r>
@@ -5818,7 +6590,7 @@
         </w:tc>
         <w:tc>
           <w:tcPr>
-            <w:tcW w:type="dxa" w:w="2339"/>
+            <w:tcW w:type="dxa" w:w="1871"/>
           </w:tcPr>
           <w:p>
             <w:r>
@@ -5826,31 +6598,41 @@
             </w:r>
           </w:p>
         </w:tc>
-      </w:tr>
-      <w:tr>
-        <w:tc>
-          <w:tcPr>
-            <w:tcW w:type="dxa" w:w="2339"/>
-          </w:tcPr>
-          <w:p>
-            <w:r>
-              <w:t>4.2</w:t>
-            </w:r>
-          </w:p>
-        </w:tc>
-        <w:tc>
-          <w:tcPr>
-            <w:tcW w:type="dxa" w:w="2339"/>
-          </w:tcPr>
-          <w:p>
-            <w:r>
-              <w:t>56</w:t>
-            </w:r>
-          </w:p>
-        </w:tc>
-        <w:tc>
-          <w:tcPr>
-            <w:tcW w:type="dxa" w:w="2339"/>
+        <w:tc>
+          <w:tcPr>
+            <w:tcW w:type="dxa" w:w="1871"/>
+          </w:tcPr>
+          <w:p>
+            <w:r>
+              <w:t>8</w:t>
+            </w:r>
+          </w:p>
+        </w:tc>
+        <w:tc>
+          <w:tcPr>
+            <w:tcW w:type="dxa" w:w="1871"/>
+          </w:tcPr>
+          <w:p>
+            <w:r>
+              <w:t>8</w:t>
+            </w:r>
+          </w:p>
+        </w:tc>
+        <w:tc>
+          <w:tcPr>
+            <w:tcW w:type="dxa" w:w="1871"/>
+          </w:tcPr>
+          <w:p>
+            <w:r>
+              <w:t>8</w:t>
+            </w:r>
+          </w:p>
+        </w:tc>
+      </w:tr>
+      <w:tr>
+        <w:tc>
+          <w:tcPr>
+            <w:tcW w:type="dxa" w:w="1871"/>
           </w:tcPr>
           <w:p>
             <w:r>
@@ -5860,7 +6642,7 @@
         </w:tc>
         <w:tc>
           <w:tcPr>
-            <w:tcW w:type="dxa" w:w="2339"/>
+            <w:tcW w:type="dxa" w:w="1871"/>
           </w:tcPr>
           <w:p>
             <w:r>
@@ -5868,31 +6650,41 @@
             </w:r>
           </w:p>
         </w:tc>
-      </w:tr>
-      <w:tr>
-        <w:tc>
-          <w:tcPr>
-            <w:tcW w:type="dxa" w:w="2339"/>
-          </w:tcPr>
-          <w:p>
-            <w:r>
-              <w:t>4.3</w:t>
-            </w:r>
-          </w:p>
-        </w:tc>
-        <w:tc>
-          <w:tcPr>
-            <w:tcW w:type="dxa" w:w="2339"/>
-          </w:tcPr>
-          <w:p>
-            <w:r>
-              <w:t>56</w:t>
-            </w:r>
-          </w:p>
-        </w:tc>
-        <w:tc>
-          <w:tcPr>
-            <w:tcW w:type="dxa" w:w="2339"/>
+        <w:tc>
+          <w:tcPr>
+            <w:tcW w:type="dxa" w:w="1871"/>
+          </w:tcPr>
+          <w:p>
+            <w:r>
+              <w:t>8</w:t>
+            </w:r>
+          </w:p>
+        </w:tc>
+        <w:tc>
+          <w:tcPr>
+            <w:tcW w:type="dxa" w:w="1871"/>
+          </w:tcPr>
+          <w:p>
+            <w:r>
+              <w:t>8</w:t>
+            </w:r>
+          </w:p>
+        </w:tc>
+        <w:tc>
+          <w:tcPr>
+            <w:tcW w:type="dxa" w:w="1871"/>
+          </w:tcPr>
+          <w:p>
+            <w:r>
+              <w:t>8</w:t>
+            </w:r>
+          </w:p>
+        </w:tc>
+      </w:tr>
+      <w:tr>
+        <w:tc>
+          <w:tcPr>
+            <w:tcW w:type="dxa" w:w="1871"/>
           </w:tcPr>
           <w:p>
             <w:r>
@@ -5902,7 +6694,37 @@
         </w:tc>
         <w:tc>
           <w:tcPr>
-            <w:tcW w:type="dxa" w:w="2339"/>
+            <w:tcW w:type="dxa" w:w="1871"/>
+          </w:tcPr>
+          <w:p>
+            <w:r>
+              <w:t>8</w:t>
+            </w:r>
+          </w:p>
+        </w:tc>
+        <w:tc>
+          <w:tcPr>
+            <w:tcW w:type="dxa" w:w="1871"/>
+          </w:tcPr>
+          <w:p>
+            <w:r>
+              <w:t>8</w:t>
+            </w:r>
+          </w:p>
+        </w:tc>
+        <w:tc>
+          <w:tcPr>
+            <w:tcW w:type="dxa" w:w="1871"/>
+          </w:tcPr>
+          <w:p>
+            <w:r>
+              <w:t>8</w:t>
+            </w:r>
+          </w:p>
+        </w:tc>
+        <w:tc>
+          <w:tcPr>
+            <w:tcW w:type="dxa" w:w="1871"/>
           </w:tcPr>
           <w:p>
             <w:r>

</xml_diff>

<commit_message>
Complete PR3 ProjectLibre report materials
Co-authored-by: alexproxor <alexproxor@users.noreply.github.com>
</commit_message>
<xml_diff>
--- a/Прохоров.А.Ф_ПР3.docx
+++ b/Прохоров.А.Ф_ПР3.docx
@@ -4055,9 +4055,19 @@
     </w:p>
     <w:p>
       <w:r>
+        <w:br w:type="page"/>
+      </w:r>
+    </w:p>
+    <w:p>
+      <w:r>
+        <w:br w:type="page"/>
+      </w:r>
+    </w:p>
+    <w:p>
+      <w:r>
         <w:rPr>
           <w:b/>
-          <w:sz w:val="25"/>
+          <w:sz w:val="26"/>
         </w:rPr>
         <w:t>Установление зависимостей работ и типов связей между ними</w:t>
       </w:r>
@@ -5079,7 +5089,7 @@
       <w:r>
         <w:rPr>
           <w:b/>
-          <w:sz w:val="25"/>
+          <w:sz w:val="26"/>
         </w:rPr>
         <w:t>Построение сетевой модели</w:t>
       </w:r>
@@ -5227,7 +5237,7 @@
                     <pic:cNvPicPr/>
                   </pic:nvPicPr>
                   <pic:blipFill>
-                    <a:blip r:embed="rId7"/>
+                    <a:blip r:embed="rId8"/>
                     <a:stretch>
                       <a:fillRect/>
                     </a:stretch>
@@ -5262,7 +5272,7 @@
       <w:r>
         <w:rPr>
           <w:b/>
-          <w:sz w:val="25"/>
+          <w:sz w:val="26"/>
         </w:rPr>
         <w:t>Назначение ресурсов на выполняемые работы</w:t>
       </w:r>
@@ -7949,6 +7959,2372 @@
         </w:tc>
       </w:tr>
     </w:tbl>
+    <w:p/>
+    <w:p>
+      <w:r>
+        <w:rPr>
+          <w:b/>
+        </w:rPr>
+        <w:t>4.3.3. Плановые характеристики в ProjectLibre</w:t>
+      </w:r>
+    </w:p>
+    <w:p>
+      <w:r>
+        <w:t>После назначения ресурсов модель проекта переносится в ProjectLibre. В отчете ниже приведены обязательные выгрузки: диаграмма Ганта, список ресурсов, Project Details, Who Does What и гистограмма загрузки ресурсов.</w:t>
+      </w:r>
+    </w:p>
+    <w:p/>
+    <w:p>
+      <w:r>
+        <w:rPr>
+          <w:b/>
+          <w:sz w:val="26"/>
+        </w:rPr>
+        <w:t>Расчет плановых характеристик проекта в ProjectLibre</w:t>
+      </w:r>
+    </w:p>
+    <w:p>
+      <w:r>
+        <w:t>Плановые характеристики рассчитаны для стандартного рабочего календаря: 5 рабочих дней в неделю, 8 часов в день. В ProjectLibre заносятся работы нижнего уровня WBS, длительности, связи, исполнители и фиксированные затраты; подготовленные CSV-файлы можно использовать как основу для переноса данных.</w:t>
+      </w:r>
+    </w:p>
+    <w:p>
+      <w:r>
+        <w:drawing>
+          <wp:inline xmlns:a="http://schemas.openxmlformats.org/drawingml/2006/main" xmlns:pic="http://schemas.openxmlformats.org/drawingml/2006/picture">
+            <wp:extent cx="6400800" cy="4374398"/>
+            <wp:docPr id="2" name="Picture 2"/>
+            <wp:cNvGraphicFramePr>
+              <a:graphicFrameLocks noChangeAspect="1"/>
+            </wp:cNvGraphicFramePr>
+            <a:graphic>
+              <a:graphicData uri="http://schemas.openxmlformats.org/drawingml/2006/picture">
+                <pic:pic>
+                  <pic:nvPicPr>
+                    <pic:cNvPr id="0" name="image.png"/>
+                    <pic:cNvPicPr/>
+                  </pic:nvPicPr>
+                  <pic:blipFill>
+                    <a:blip r:embed="rId9"/>
+                    <a:stretch>
+                      <a:fillRect/>
+                    </a:stretch>
+                  </pic:blipFill>
+                  <pic:spPr>
+                    <a:xfrm>
+                      <a:off x="0" y="0"/>
+                      <a:ext cx="6400800" cy="4374398"/>
+                    </a:xfrm>
+                    <a:prstGeom prst="rect"/>
+                  </pic:spPr>
+                </pic:pic>
+              </a:graphicData>
+            </a:graphic>
+          </wp:inline>
+        </w:drawing>
+      </w:r>
+    </w:p>
+    <w:p>
+      <w:pPr>
+        <w:jc w:val="center"/>
+      </w:pPr>
+      <w:r>
+        <w:rPr>
+          <w:b/>
+        </w:rPr>
+        <w:t>Рисунок 2 - Диаграмма Ганта проекта</w:t>
+      </w:r>
+    </w:p>
+    <w:p>
+      <w:pPr>
+        <w:jc w:val="right"/>
+      </w:pPr>
+      <w:r>
+        <w:rPr>
+          <w:b/>
+        </w:rPr>
+        <w:t>Таблица 4.6</w:t>
+      </w:r>
+    </w:p>
+    <w:tbl>
+      <w:tblPr>
+        <w:tblStyle w:val="a4"/>
+        <w:tblW w:type="auto" w:w="0"/>
+        <w:tblLook w:firstColumn="1" w:firstRow="1" w:lastColumn="0" w:lastRow="0" w:noHBand="0" w:noVBand="1" w:val="04A0"/>
+      </w:tblPr>
+      <w:tblGrid>
+        <w:gridCol w:w="2339"/>
+        <w:gridCol w:w="2339"/>
+        <w:gridCol w:w="2339"/>
+        <w:gridCol w:w="2339"/>
+      </w:tblGrid>
+      <w:tr>
+        <w:tc>
+          <w:tcPr>
+            <w:tcW w:type="dxa" w:w="2339"/>
+          </w:tcPr>
+          <w:p>
+            <w:r>
+              <w:t>Ресурс</w:t>
+            </w:r>
+          </w:p>
+        </w:tc>
+        <w:tc>
+          <w:tcPr>
+            <w:tcW w:type="dxa" w:w="2339"/>
+          </w:tcPr>
+          <w:p>
+            <w:r>
+              <w:t>Тип</w:t>
+            </w:r>
+          </w:p>
+        </w:tc>
+        <w:tc>
+          <w:tcPr>
+            <w:tcW w:type="dxa" w:w="2339"/>
+          </w:tcPr>
+          <w:p>
+            <w:r>
+              <w:t>Макс. загрузка, чел.</w:t>
+            </w:r>
+          </w:p>
+        </w:tc>
+        <w:tc>
+          <w:tcPr>
+            <w:tcW w:type="dxa" w:w="2339"/>
+          </w:tcPr>
+          <w:p>
+            <w:r>
+              <w:t>Плановая трудоемкость, ч</w:t>
+            </w:r>
+          </w:p>
+        </w:tc>
+      </w:tr>
+      <w:tr>
+        <w:tc>
+          <w:tcPr>
+            <w:tcW w:type="dxa" w:w="2339"/>
+          </w:tcPr>
+          <w:p>
+            <w:r>
+              <w:t>BI-аналитик</w:t>
+            </w:r>
+          </w:p>
+        </w:tc>
+        <w:tc>
+          <w:tcPr>
+            <w:tcW w:type="dxa" w:w="2339"/>
+          </w:tcPr>
+          <w:p>
+            <w:r>
+              <w:t>Трудовой</w:t>
+            </w:r>
+          </w:p>
+        </w:tc>
+        <w:tc>
+          <w:tcPr>
+            <w:tcW w:type="dxa" w:w="2339"/>
+          </w:tcPr>
+          <w:p>
+            <w:r>
+              <w:t>0,5</w:t>
+            </w:r>
+          </w:p>
+        </w:tc>
+        <w:tc>
+          <w:tcPr>
+            <w:tcW w:type="dxa" w:w="2339"/>
+          </w:tcPr>
+          <w:p>
+            <w:r>
+              <w:t>20,0</w:t>
+            </w:r>
+          </w:p>
+        </w:tc>
+      </w:tr>
+      <w:tr>
+        <w:tc>
+          <w:tcPr>
+            <w:tcW w:type="dxa" w:w="2339"/>
+          </w:tcPr>
+          <w:p>
+            <w:r>
+              <w:t>Backend-разработчик</w:t>
+            </w:r>
+          </w:p>
+        </w:tc>
+        <w:tc>
+          <w:tcPr>
+            <w:tcW w:type="dxa" w:w="2339"/>
+          </w:tcPr>
+          <w:p>
+            <w:r>
+              <w:t>Трудовой</w:t>
+            </w:r>
+          </w:p>
+        </w:tc>
+        <w:tc>
+          <w:tcPr>
+            <w:tcW w:type="dxa" w:w="2339"/>
+          </w:tcPr>
+          <w:p>
+            <w:r>
+              <w:t>2,0</w:t>
+            </w:r>
+          </w:p>
+        </w:tc>
+        <w:tc>
+          <w:tcPr>
+            <w:tcW w:type="dxa" w:w="2339"/>
+          </w:tcPr>
+          <w:p>
+            <w:r>
+              <w:t>124,0</w:t>
+            </w:r>
+          </w:p>
+        </w:tc>
+      </w:tr>
+      <w:tr>
+        <w:tc>
+          <w:tcPr>
+            <w:tcW w:type="dxa" w:w="2339"/>
+          </w:tcPr>
+          <w:p>
+            <w:r>
+              <w:t>DevOps-инженер</w:t>
+            </w:r>
+          </w:p>
+        </w:tc>
+        <w:tc>
+          <w:tcPr>
+            <w:tcW w:type="dxa" w:w="2339"/>
+          </w:tcPr>
+          <w:p>
+            <w:r>
+              <w:t>Трудовой</w:t>
+            </w:r>
+          </w:p>
+        </w:tc>
+        <w:tc>
+          <w:tcPr>
+            <w:tcW w:type="dxa" w:w="2339"/>
+          </w:tcPr>
+          <w:p>
+            <w:r>
+              <w:t>1,25</w:t>
+            </w:r>
+          </w:p>
+        </w:tc>
+        <w:tc>
+          <w:tcPr>
+            <w:tcW w:type="dxa" w:w="2339"/>
+          </w:tcPr>
+          <w:p>
+            <w:r>
+              <w:t>32,0</w:t>
+            </w:r>
+          </w:p>
+        </w:tc>
+      </w:tr>
+      <w:tr>
+        <w:tc>
+          <w:tcPr>
+            <w:tcW w:type="dxa" w:w="2339"/>
+          </w:tcPr>
+          <w:p>
+            <w:r>
+              <w:t>Frontend-разработчик</w:t>
+            </w:r>
+          </w:p>
+        </w:tc>
+        <w:tc>
+          <w:tcPr>
+            <w:tcW w:type="dxa" w:w="2339"/>
+          </w:tcPr>
+          <w:p>
+            <w:r>
+              <w:t>Трудовой</w:t>
+            </w:r>
+          </w:p>
+        </w:tc>
+        <w:tc>
+          <w:tcPr>
+            <w:tcW w:type="dxa" w:w="2339"/>
+          </w:tcPr>
+          <w:p>
+            <w:r>
+              <w:t>1,5</w:t>
+            </w:r>
+          </w:p>
+        </w:tc>
+        <w:tc>
+          <w:tcPr>
+            <w:tcW w:type="dxa" w:w="2339"/>
+          </w:tcPr>
+          <w:p>
+            <w:r>
+              <w:t>84,0</w:t>
+            </w:r>
+          </w:p>
+        </w:tc>
+      </w:tr>
+      <w:tr>
+        <w:tc>
+          <w:tcPr>
+            <w:tcW w:type="dxa" w:w="2339"/>
+          </w:tcPr>
+          <w:p>
+            <w:r>
+              <w:t>UX/UI-дизайнер</w:t>
+            </w:r>
+          </w:p>
+        </w:tc>
+        <w:tc>
+          <w:tcPr>
+            <w:tcW w:type="dxa" w:w="2339"/>
+          </w:tcPr>
+          <w:p>
+            <w:r>
+              <w:t>Трудовой</w:t>
+            </w:r>
+          </w:p>
+        </w:tc>
+        <w:tc>
+          <w:tcPr>
+            <w:tcW w:type="dxa" w:w="2339"/>
+          </w:tcPr>
+          <w:p>
+            <w:r>
+              <w:t>1,0</w:t>
+            </w:r>
+          </w:p>
+        </w:tc>
+        <w:tc>
+          <w:tcPr>
+            <w:tcW w:type="dxa" w:w="2339"/>
+          </w:tcPr>
+          <w:p>
+            <w:r>
+              <w:t>16,0</w:t>
+            </w:r>
+          </w:p>
+        </w:tc>
+      </w:tr>
+      <w:tr>
+        <w:tc>
+          <w:tcPr>
+            <w:tcW w:type="dxa" w:w="2339"/>
+          </w:tcPr>
+          <w:p>
+            <w:r>
+              <w:t>Администратор БД</w:t>
+            </w:r>
+          </w:p>
+        </w:tc>
+        <w:tc>
+          <w:tcPr>
+            <w:tcW w:type="dxa" w:w="2339"/>
+          </w:tcPr>
+          <w:p>
+            <w:r>
+              <w:t>Трудовой</w:t>
+            </w:r>
+          </w:p>
+        </w:tc>
+        <w:tc>
+          <w:tcPr>
+            <w:tcW w:type="dxa" w:w="2339"/>
+          </w:tcPr>
+          <w:p>
+            <w:r>
+              <w:t>0,5</w:t>
+            </w:r>
+          </w:p>
+        </w:tc>
+        <w:tc>
+          <w:tcPr>
+            <w:tcW w:type="dxa" w:w="2339"/>
+          </w:tcPr>
+          <w:p>
+            <w:r>
+              <w:t>8,0</w:t>
+            </w:r>
+          </w:p>
+        </w:tc>
+      </w:tr>
+      <w:tr>
+        <w:tc>
+          <w:tcPr>
+            <w:tcW w:type="dxa" w:w="2339"/>
+          </w:tcPr>
+          <w:p>
+            <w:r>
+              <w:t>Архитектор БД</w:t>
+            </w:r>
+          </w:p>
+        </w:tc>
+        <w:tc>
+          <w:tcPr>
+            <w:tcW w:type="dxa" w:w="2339"/>
+          </w:tcPr>
+          <w:p>
+            <w:r>
+              <w:t>Трудовой</w:t>
+            </w:r>
+          </w:p>
+        </w:tc>
+        <w:tc>
+          <w:tcPr>
+            <w:tcW w:type="dxa" w:w="2339"/>
+          </w:tcPr>
+          <w:p>
+            <w:r>
+              <w:t>1,0</w:t>
+            </w:r>
+          </w:p>
+        </w:tc>
+        <w:tc>
+          <w:tcPr>
+            <w:tcW w:type="dxa" w:w="2339"/>
+          </w:tcPr>
+          <w:p>
+            <w:r>
+              <w:t>16,0</w:t>
+            </w:r>
+          </w:p>
+        </w:tc>
+      </w:tr>
+      <w:tr>
+        <w:tc>
+          <w:tcPr>
+            <w:tcW w:type="dxa" w:w="2339"/>
+          </w:tcPr>
+          <w:p>
+            <w:r>
+              <w:t>Бизнес-аналитик</w:t>
+            </w:r>
+          </w:p>
+        </w:tc>
+        <w:tc>
+          <w:tcPr>
+            <w:tcW w:type="dxa" w:w="2339"/>
+          </w:tcPr>
+          <w:p>
+            <w:r>
+              <w:t>Трудовой</w:t>
+            </w:r>
+          </w:p>
+        </w:tc>
+        <w:tc>
+          <w:tcPr>
+            <w:tcW w:type="dxa" w:w="2339"/>
+          </w:tcPr>
+          <w:p>
+            <w:r>
+              <w:t>1,0</w:t>
+            </w:r>
+          </w:p>
+        </w:tc>
+        <w:tc>
+          <w:tcPr>
+            <w:tcW w:type="dxa" w:w="2339"/>
+          </w:tcPr>
+          <w:p>
+            <w:r>
+              <w:t>60,0</w:t>
+            </w:r>
+          </w:p>
+        </w:tc>
+      </w:tr>
+      <w:tr>
+        <w:tc>
+          <w:tcPr>
+            <w:tcW w:type="dxa" w:w="2339"/>
+          </w:tcPr>
+          <w:p>
+            <w:r>
+              <w:t>Инженер по интеграциям</w:t>
+            </w:r>
+          </w:p>
+        </w:tc>
+        <w:tc>
+          <w:tcPr>
+            <w:tcW w:type="dxa" w:w="2339"/>
+          </w:tcPr>
+          <w:p>
+            <w:r>
+              <w:t>Трудовой</w:t>
+            </w:r>
+          </w:p>
+        </w:tc>
+        <w:tc>
+          <w:tcPr>
+            <w:tcW w:type="dxa" w:w="2339"/>
+          </w:tcPr>
+          <w:p>
+            <w:r>
+              <w:t>0,5</w:t>
+            </w:r>
+          </w:p>
+        </w:tc>
+        <w:tc>
+          <w:tcPr>
+            <w:tcW w:type="dxa" w:w="2339"/>
+          </w:tcPr>
+          <w:p>
+            <w:r>
+              <w:t>12,0</w:t>
+            </w:r>
+          </w:p>
+        </w:tc>
+      </w:tr>
+      <w:tr>
+        <w:tc>
+          <w:tcPr>
+            <w:tcW w:type="dxa" w:w="2339"/>
+          </w:tcPr>
+          <w:p>
+            <w:r>
+              <w:t>Инженер по нагрузочному тестированию</w:t>
+            </w:r>
+          </w:p>
+        </w:tc>
+        <w:tc>
+          <w:tcPr>
+            <w:tcW w:type="dxa" w:w="2339"/>
+          </w:tcPr>
+          <w:p>
+            <w:r>
+              <w:t>Трудовой</w:t>
+            </w:r>
+          </w:p>
+        </w:tc>
+        <w:tc>
+          <w:tcPr>
+            <w:tcW w:type="dxa" w:w="2339"/>
+          </w:tcPr>
+          <w:p>
+            <w:r>
+              <w:t>0,5</w:t>
+            </w:r>
+          </w:p>
+        </w:tc>
+        <w:tc>
+          <w:tcPr>
+            <w:tcW w:type="dxa" w:w="2339"/>
+          </w:tcPr>
+          <w:p>
+            <w:r>
+              <w:t>8,0</w:t>
+            </w:r>
+          </w:p>
+        </w:tc>
+      </w:tr>
+      <w:tr>
+        <w:tc>
+          <w:tcPr>
+            <w:tcW w:type="dxa" w:w="2339"/>
+          </w:tcPr>
+          <w:p>
+            <w:r>
+              <w:t>Представитель заказчика</w:t>
+            </w:r>
+          </w:p>
+        </w:tc>
+        <w:tc>
+          <w:tcPr>
+            <w:tcW w:type="dxa" w:w="2339"/>
+          </w:tcPr>
+          <w:p>
+            <w:r>
+              <w:t>Трудовой</w:t>
+            </w:r>
+          </w:p>
+        </w:tc>
+        <w:tc>
+          <w:tcPr>
+            <w:tcW w:type="dxa" w:w="2339"/>
+          </w:tcPr>
+          <w:p>
+            <w:r>
+              <w:t>0,25</w:t>
+            </w:r>
+          </w:p>
+        </w:tc>
+        <w:tc>
+          <w:tcPr>
+            <w:tcW w:type="dxa" w:w="2339"/>
+          </w:tcPr>
+          <w:p>
+            <w:r>
+              <w:t>8,0</w:t>
+            </w:r>
+          </w:p>
+        </w:tc>
+      </w:tr>
+      <w:tr>
+        <w:tc>
+          <w:tcPr>
+            <w:tcW w:type="dxa" w:w="2339"/>
+          </w:tcPr>
+          <w:p>
+            <w:r>
+              <w:t>Разработчик</w:t>
+            </w:r>
+          </w:p>
+        </w:tc>
+        <w:tc>
+          <w:tcPr>
+            <w:tcW w:type="dxa" w:w="2339"/>
+          </w:tcPr>
+          <w:p>
+            <w:r>
+              <w:t>Трудовой</w:t>
+            </w:r>
+          </w:p>
+        </w:tc>
+        <w:tc>
+          <w:tcPr>
+            <w:tcW w:type="dxa" w:w="2339"/>
+          </w:tcPr>
+          <w:p>
+            <w:r>
+              <w:t>0,5</w:t>
+            </w:r>
+          </w:p>
+        </w:tc>
+        <w:tc>
+          <w:tcPr>
+            <w:tcW w:type="dxa" w:w="2339"/>
+          </w:tcPr>
+          <w:p>
+            <w:r>
+              <w:t>18,0</w:t>
+            </w:r>
+          </w:p>
+        </w:tc>
+      </w:tr>
+      <w:tr>
+        <w:tc>
+          <w:tcPr>
+            <w:tcW w:type="dxa" w:w="2339"/>
+          </w:tcPr>
+          <w:p>
+            <w:r>
+              <w:t>Руководитель проекта</w:t>
+            </w:r>
+          </w:p>
+        </w:tc>
+        <w:tc>
+          <w:tcPr>
+            <w:tcW w:type="dxa" w:w="2339"/>
+          </w:tcPr>
+          <w:p>
+            <w:r>
+              <w:t>Трудовой</w:t>
+            </w:r>
+          </w:p>
+        </w:tc>
+        <w:tc>
+          <w:tcPr>
+            <w:tcW w:type="dxa" w:w="2339"/>
+          </w:tcPr>
+          <w:p>
+            <w:r>
+              <w:t>0,5</w:t>
+            </w:r>
+          </w:p>
+        </w:tc>
+        <w:tc>
+          <w:tcPr>
+            <w:tcW w:type="dxa" w:w="2339"/>
+          </w:tcPr>
+          <w:p>
+            <w:r>
+              <w:t>62,0</w:t>
+            </w:r>
+          </w:p>
+        </w:tc>
+      </w:tr>
+      <w:tr>
+        <w:tc>
+          <w:tcPr>
+            <w:tcW w:type="dxa" w:w="2339"/>
+          </w:tcPr>
+          <w:p>
+            <w:r>
+              <w:t>Системный аналитик</w:t>
+            </w:r>
+          </w:p>
+        </w:tc>
+        <w:tc>
+          <w:tcPr>
+            <w:tcW w:type="dxa" w:w="2339"/>
+          </w:tcPr>
+          <w:p>
+            <w:r>
+              <w:t>Трудовой</w:t>
+            </w:r>
+          </w:p>
+        </w:tc>
+        <w:tc>
+          <w:tcPr>
+            <w:tcW w:type="dxa" w:w="2339"/>
+          </w:tcPr>
+          <w:p>
+            <w:r>
+              <w:t>1,0</w:t>
+            </w:r>
+          </w:p>
+        </w:tc>
+        <w:tc>
+          <w:tcPr>
+            <w:tcW w:type="dxa" w:w="2339"/>
+          </w:tcPr>
+          <w:p>
+            <w:r>
+              <w:t>82,0</w:t>
+            </w:r>
+          </w:p>
+        </w:tc>
+      </w:tr>
+      <w:tr>
+        <w:tc>
+          <w:tcPr>
+            <w:tcW w:type="dxa" w:w="2339"/>
+          </w:tcPr>
+          <w:p>
+            <w:r>
+              <w:t>Системный архитектор</w:t>
+            </w:r>
+          </w:p>
+        </w:tc>
+        <w:tc>
+          <w:tcPr>
+            <w:tcW w:type="dxa" w:w="2339"/>
+          </w:tcPr>
+          <w:p>
+            <w:r>
+              <w:t>Трудовой</w:t>
+            </w:r>
+          </w:p>
+        </w:tc>
+        <w:tc>
+          <w:tcPr>
+            <w:tcW w:type="dxa" w:w="2339"/>
+          </w:tcPr>
+          <w:p>
+            <w:r>
+              <w:t>1,0</w:t>
+            </w:r>
+          </w:p>
+        </w:tc>
+        <w:tc>
+          <w:tcPr>
+            <w:tcW w:type="dxa" w:w="2339"/>
+          </w:tcPr>
+          <w:p>
+            <w:r>
+              <w:t>24,0</w:t>
+            </w:r>
+          </w:p>
+        </w:tc>
+      </w:tr>
+      <w:tr>
+        <w:tc>
+          <w:tcPr>
+            <w:tcW w:type="dxa" w:w="2339"/>
+          </w:tcPr>
+          <w:p>
+            <w:r>
+              <w:t>Специалист поддержки</w:t>
+            </w:r>
+          </w:p>
+        </w:tc>
+        <w:tc>
+          <w:tcPr>
+            <w:tcW w:type="dxa" w:w="2339"/>
+          </w:tcPr>
+          <w:p>
+            <w:r>
+              <w:t>Трудовой</w:t>
+            </w:r>
+          </w:p>
+        </w:tc>
+        <w:tc>
+          <w:tcPr>
+            <w:tcW w:type="dxa" w:w="2339"/>
+          </w:tcPr>
+          <w:p>
+            <w:r>
+              <w:t>0,5</w:t>
+            </w:r>
+          </w:p>
+        </w:tc>
+        <w:tc>
+          <w:tcPr>
+            <w:tcW w:type="dxa" w:w="2339"/>
+          </w:tcPr>
+          <w:p>
+            <w:r>
+              <w:t>12,0</w:t>
+            </w:r>
+          </w:p>
+        </w:tc>
+      </w:tr>
+      <w:tr>
+        <w:tc>
+          <w:tcPr>
+            <w:tcW w:type="dxa" w:w="2339"/>
+          </w:tcPr>
+          <w:p>
+            <w:r>
+              <w:t>Специалист сопровождения</w:t>
+            </w:r>
+          </w:p>
+        </w:tc>
+        <w:tc>
+          <w:tcPr>
+            <w:tcW w:type="dxa" w:w="2339"/>
+          </w:tcPr>
+          <w:p>
+            <w:r>
+              <w:t>Трудовой</w:t>
+            </w:r>
+          </w:p>
+        </w:tc>
+        <w:tc>
+          <w:tcPr>
+            <w:tcW w:type="dxa" w:w="2339"/>
+          </w:tcPr>
+          <w:p>
+            <w:r>
+              <w:t>0,25</w:t>
+            </w:r>
+          </w:p>
+        </w:tc>
+        <w:tc>
+          <w:tcPr>
+            <w:tcW w:type="dxa" w:w="2339"/>
+          </w:tcPr>
+          <w:p>
+            <w:r>
+              <w:t>2,0</w:t>
+            </w:r>
+          </w:p>
+        </w:tc>
+      </w:tr>
+      <w:tr>
+        <w:tc>
+          <w:tcPr>
+            <w:tcW w:type="dxa" w:w="2339"/>
+          </w:tcPr>
+          <w:p>
+            <w:r>
+              <w:t>Тестировщик</w:t>
+            </w:r>
+          </w:p>
+        </w:tc>
+        <w:tc>
+          <w:tcPr>
+            <w:tcW w:type="dxa" w:w="2339"/>
+          </w:tcPr>
+          <w:p>
+            <w:r>
+              <w:t>Трудовой</w:t>
+            </w:r>
+          </w:p>
+        </w:tc>
+        <w:tc>
+          <w:tcPr>
+            <w:tcW w:type="dxa" w:w="2339"/>
+          </w:tcPr>
+          <w:p>
+            <w:r>
+              <w:t>1,0</w:t>
+            </w:r>
+          </w:p>
+        </w:tc>
+        <w:tc>
+          <w:tcPr>
+            <w:tcW w:type="dxa" w:w="2339"/>
+          </w:tcPr>
+          <w:p>
+            <w:r>
+              <w:t>70,0</w:t>
+            </w:r>
+          </w:p>
+        </w:tc>
+      </w:tr>
+      <w:tr>
+        <w:tc>
+          <w:tcPr>
+            <w:tcW w:type="dxa" w:w="2339"/>
+          </w:tcPr>
+          <w:p>
+            <w:r>
+              <w:t>Финансовый аналитик</w:t>
+            </w:r>
+          </w:p>
+        </w:tc>
+        <w:tc>
+          <w:tcPr>
+            <w:tcW w:type="dxa" w:w="2339"/>
+          </w:tcPr>
+          <w:p>
+            <w:r>
+              <w:t>Трудовой</w:t>
+            </w:r>
+          </w:p>
+        </w:tc>
+        <w:tc>
+          <w:tcPr>
+            <w:tcW w:type="dxa" w:w="2339"/>
+          </w:tcPr>
+          <w:p>
+            <w:r>
+              <w:t>0,25</w:t>
+            </w:r>
+          </w:p>
+        </w:tc>
+        <w:tc>
+          <w:tcPr>
+            <w:tcW w:type="dxa" w:w="2339"/>
+          </w:tcPr>
+          <w:p>
+            <w:r>
+              <w:t>8,0</w:t>
+            </w:r>
+          </w:p>
+        </w:tc>
+      </w:tr>
+    </w:tbl>
+    <w:p>
+      <w:pPr>
+        <w:jc w:val="right"/>
+      </w:pPr>
+      <w:r>
+        <w:rPr>
+          <w:b/>
+        </w:rPr>
+        <w:t>Таблица 4.7</w:t>
+      </w:r>
+    </w:p>
+    <w:tbl>
+      <w:tblPr>
+        <w:tblStyle w:val="a4"/>
+        <w:tblW w:type="auto" w:w="0"/>
+        <w:tblLook w:firstColumn="1" w:firstRow="1" w:lastColumn="0" w:lastRow="0" w:noHBand="0" w:noVBand="1" w:val="04A0"/>
+      </w:tblPr>
+      <w:tblGrid>
+        <w:gridCol w:w="4677"/>
+        <w:gridCol w:w="4677"/>
+      </w:tblGrid>
+      <w:tr>
+        <w:tc>
+          <w:tcPr>
+            <w:tcW w:type="dxa" w:w="4677"/>
+          </w:tcPr>
+          <w:p>
+            <w:r>
+              <w:t>Параметр</w:t>
+            </w:r>
+          </w:p>
+        </w:tc>
+        <w:tc>
+          <w:tcPr>
+            <w:tcW w:type="dxa" w:w="4677"/>
+          </w:tcPr>
+          <w:p>
+            <w:r>
+              <w:t>Значение</w:t>
+            </w:r>
+          </w:p>
+        </w:tc>
+      </w:tr>
+      <w:tr>
+        <w:tc>
+          <w:tcPr>
+            <w:tcW w:type="dxa" w:w="4677"/>
+          </w:tcPr>
+          <w:p>
+            <w:r>
+              <w:t>Название проекта</w:t>
+            </w:r>
+          </w:p>
+        </w:tc>
+        <w:tc>
+          <w:tcPr>
+            <w:tcW w:type="dxa" w:w="4677"/>
+          </w:tcPr>
+          <w:p>
+            <w:r>
+              <w:t>ИС «ЖКХ-Заявки»</w:t>
+            </w:r>
+          </w:p>
+        </w:tc>
+      </w:tr>
+      <w:tr>
+        <w:tc>
+          <w:tcPr>
+            <w:tcW w:type="dxa" w:w="4677"/>
+          </w:tcPr>
+          <w:p>
+            <w:r>
+              <w:t>Дата начала</w:t>
+            </w:r>
+          </w:p>
+        </w:tc>
+        <w:tc>
+          <w:tcPr>
+            <w:tcW w:type="dxa" w:w="4677"/>
+          </w:tcPr>
+          <w:p>
+            <w:r>
+              <w:t>06.05.2026</w:t>
+            </w:r>
+          </w:p>
+        </w:tc>
+      </w:tr>
+      <w:tr>
+        <w:tc>
+          <w:tcPr>
+            <w:tcW w:type="dxa" w:w="4677"/>
+          </w:tcPr>
+          <w:p>
+            <w:r>
+              <w:t>Дата окончания</w:t>
+            </w:r>
+          </w:p>
+        </w:tc>
+        <w:tc>
+          <w:tcPr>
+            <w:tcW w:type="dxa" w:w="4677"/>
+          </w:tcPr>
+          <w:p>
+            <w:r>
+              <w:t>07.07.2026</w:t>
+            </w:r>
+          </w:p>
+        </w:tc>
+      </w:tr>
+      <w:tr>
+        <w:tc>
+          <w:tcPr>
+            <w:tcW w:type="dxa" w:w="4677"/>
+          </w:tcPr>
+          <w:p>
+            <w:r>
+              <w:t>Календарь</w:t>
+            </w:r>
+          </w:p>
+        </w:tc>
+        <w:tc>
+          <w:tcPr>
+            <w:tcW w:type="dxa" w:w="4677"/>
+          </w:tcPr>
+          <w:p>
+            <w:r>
+              <w:t>Стандартный: 5-дневная рабочая неделя, 8 часов в день</w:t>
+            </w:r>
+          </w:p>
+        </w:tc>
+      </w:tr>
+      <w:tr>
+        <w:tc>
+          <w:tcPr>
+            <w:tcW w:type="dxa" w:w="4677"/>
+          </w:tcPr>
+          <w:p>
+            <w:r>
+              <w:t>Количество работ нижнего уровня</w:t>
+            </w:r>
+          </w:p>
+        </w:tc>
+        <w:tc>
+          <w:tcPr>
+            <w:tcW w:type="dxa" w:w="4677"/>
+          </w:tcPr>
+          <w:p>
+            <w:r>
+              <w:t>26</w:t>
+            </w:r>
+          </w:p>
+        </w:tc>
+      </w:tr>
+      <w:tr>
+        <w:tc>
+          <w:tcPr>
+            <w:tcW w:type="dxa" w:w="4677"/>
+          </w:tcPr>
+          <w:p>
+            <w:r>
+              <w:t>Плановая трудоемкость</w:t>
+            </w:r>
+          </w:p>
+        </w:tc>
+        <w:tc>
+          <w:tcPr>
+            <w:tcW w:type="dxa" w:w="4677"/>
+          </w:tcPr>
+          <w:p>
+            <w:r>
+              <w:t>632 ч</w:t>
+            </w:r>
+          </w:p>
+        </w:tc>
+      </w:tr>
+      <w:tr>
+        <w:tc>
+          <w:tcPr>
+            <w:tcW w:type="dxa" w:w="4677"/>
+          </w:tcPr>
+          <w:p>
+            <w:r>
+              <w:t>Фиксированные затраты</w:t>
+            </w:r>
+          </w:p>
+        </w:tc>
+        <w:tc>
+          <w:tcPr>
+            <w:tcW w:type="dxa" w:w="4677"/>
+          </w:tcPr>
+          <w:p>
+            <w:r>
+              <w:t>431 тыс. руб.</w:t>
+            </w:r>
+          </w:p>
+        </w:tc>
+      </w:tr>
+      <w:tr>
+        <w:tc>
+          <w:tcPr>
+            <w:tcW w:type="dxa" w:w="4677"/>
+          </w:tcPr>
+          <w:p>
+            <w:r>
+              <w:t>Критерий расчета</w:t>
+            </w:r>
+          </w:p>
+        </w:tc>
+        <w:tc>
+          <w:tcPr>
+            <w:tcW w:type="dxa" w:w="4677"/>
+          </w:tcPr>
+          <w:p>
+            <w:r>
+              <w:t>ранее начало по зависимостям FS, SS, FF, SF</w:t>
+            </w:r>
+          </w:p>
+        </w:tc>
+      </w:tr>
+    </w:tbl>
+    <w:p>
+      <w:pPr>
+        <w:jc w:val="right"/>
+      </w:pPr>
+      <w:r>
+        <w:rPr>
+          <w:b/>
+        </w:rPr>
+        <w:t>Таблица 4.8</w:t>
+      </w:r>
+    </w:p>
+    <w:tbl>
+      <w:tblPr>
+        <w:tblStyle w:val="a4"/>
+        <w:tblW w:type="auto" w:w="0"/>
+        <w:tblLook w:firstColumn="1" w:firstRow="1" w:lastColumn="0" w:lastRow="0" w:noHBand="0" w:noVBand="1" w:val="04A0"/>
+      </w:tblPr>
+      <w:tblGrid>
+        <w:gridCol w:w="2339"/>
+        <w:gridCol w:w="2339"/>
+        <w:gridCol w:w="2339"/>
+        <w:gridCol w:w="2339"/>
+      </w:tblGrid>
+      <w:tr>
+        <w:tc>
+          <w:tcPr>
+            <w:tcW w:type="dxa" w:w="2339"/>
+          </w:tcPr>
+          <w:p>
+            <w:r>
+              <w:t>Работа</w:t>
+            </w:r>
+          </w:p>
+        </w:tc>
+        <w:tc>
+          <w:tcPr>
+            <w:tcW w:type="dxa" w:w="2339"/>
+          </w:tcPr>
+          <w:p>
+            <w:r>
+              <w:t>Наименование</w:t>
+            </w:r>
+          </w:p>
+        </w:tc>
+        <w:tc>
+          <w:tcPr>
+            <w:tcW w:type="dxa" w:w="2339"/>
+          </w:tcPr>
+          <w:p>
+            <w:r>
+              <w:t>Назначенные ресурсы</w:t>
+            </w:r>
+          </w:p>
+        </w:tc>
+        <w:tc>
+          <w:tcPr>
+            <w:tcW w:type="dxa" w:w="2339"/>
+          </w:tcPr>
+          <w:p>
+            <w:r>
+              <w:t>Фиксированные затраты</w:t>
+            </w:r>
+          </w:p>
+        </w:tc>
+      </w:tr>
+      <w:tr>
+        <w:tc>
+          <w:tcPr>
+            <w:tcW w:type="dxa" w:w="2339"/>
+          </w:tcPr>
+          <w:p>
+            <w:r>
+              <w:t>1.1</w:t>
+            </w:r>
+          </w:p>
+        </w:tc>
+        <w:tc>
+          <w:tcPr>
+            <w:tcW w:type="dxa" w:w="2339"/>
+          </w:tcPr>
+          <w:p>
+            <w:r>
+              <w:t>Формирование устава проекта</w:t>
+            </w:r>
+          </w:p>
+        </w:tc>
+        <w:tc>
+          <w:tcPr>
+            <w:tcW w:type="dxa" w:w="2339"/>
+          </w:tcPr>
+          <w:p>
+            <w:r>
+              <w:t>Руководитель проекта (0,5 чел.); Бизнес-аналитик (0,25 чел.)</w:t>
+            </w:r>
+          </w:p>
+        </w:tc>
+        <w:tc>
+          <w:tcPr>
+            <w:tcW w:type="dxa" w:w="2339"/>
+          </w:tcPr>
+          <w:p>
+            <w:r>
+              <w:t>8 тыс. руб.</w:t>
+            </w:r>
+          </w:p>
+        </w:tc>
+      </w:tr>
+      <w:tr>
+        <w:tc>
+          <w:tcPr>
+            <w:tcW w:type="dxa" w:w="2339"/>
+          </w:tcPr>
+          <w:p>
+            <w:r>
+              <w:t>1.2</w:t>
+            </w:r>
+          </w:p>
+        </w:tc>
+        <w:tc>
+          <w:tcPr>
+            <w:tcW w:type="dxa" w:w="2339"/>
+          </w:tcPr>
+          <w:p>
+            <w:r>
+              <w:t>Определение целей, границ и критериев успеха</w:t>
+            </w:r>
+          </w:p>
+        </w:tc>
+        <w:tc>
+          <w:tcPr>
+            <w:tcW w:type="dxa" w:w="2339"/>
+          </w:tcPr>
+          <w:p>
+            <w:r>
+              <w:t>Руководитель проекта (0,5 чел.); Представитель заказчика (0,25 чел.)</w:t>
+            </w:r>
+          </w:p>
+        </w:tc>
+        <w:tc>
+          <w:tcPr>
+            <w:tcW w:type="dxa" w:w="2339"/>
+          </w:tcPr>
+          <w:p>
+            <w:r>
+              <w:t>10 тыс. руб.</w:t>
+            </w:r>
+          </w:p>
+        </w:tc>
+      </w:tr>
+      <w:tr>
+        <w:tc>
+          <w:tcPr>
+            <w:tcW w:type="dxa" w:w="2339"/>
+          </w:tcPr>
+          <w:p>
+            <w:r>
+              <w:t>1.3</w:t>
+            </w:r>
+          </w:p>
+        </w:tc>
+        <w:tc>
+          <w:tcPr>
+            <w:tcW w:type="dxa" w:w="2339"/>
+          </w:tcPr>
+          <w:p>
+            <w:r>
+              <w:t>План-график, бюджет, риски и коммуникации</w:t>
+            </w:r>
+          </w:p>
+        </w:tc>
+        <w:tc>
+          <w:tcPr>
+            <w:tcW w:type="dxa" w:w="2339"/>
+          </w:tcPr>
+          <w:p>
+            <w:r>
+              <w:t>Руководитель проекта (0,5 чел.); Финансовый аналитик (0,25 чел.)</w:t>
+            </w:r>
+          </w:p>
+        </w:tc>
+        <w:tc>
+          <w:tcPr>
+            <w:tcW w:type="dxa" w:w="2339"/>
+          </w:tcPr>
+          <w:p>
+            <w:r>
+              <w:t>12 тыс. руб.</w:t>
+            </w:r>
+          </w:p>
+        </w:tc>
+      </w:tr>
+      <w:tr>
+        <w:tc>
+          <w:tcPr>
+            <w:tcW w:type="dxa" w:w="2339"/>
+          </w:tcPr>
+          <w:p>
+            <w:r>
+              <w:t>2.1</w:t>
+            </w:r>
+          </w:p>
+        </w:tc>
+        <w:tc>
+          <w:tcPr>
+            <w:tcW w:type="dxa" w:w="2339"/>
+          </w:tcPr>
+          <w:p>
+            <w:r>
+              <w:t>Сбор и анализ требований (администрация, УК, жители)</w:t>
+            </w:r>
+          </w:p>
+        </w:tc>
+        <w:tc>
+          <w:tcPr>
+            <w:tcW w:type="dxa" w:w="2339"/>
+          </w:tcPr>
+          <w:p>
+            <w:r>
+              <w:t>Бизнес-аналитик (1,0 чел.); Системный аналитик (0,5 чел.)</w:t>
+            </w:r>
+          </w:p>
+        </w:tc>
+        <w:tc>
+          <w:tcPr>
+            <w:tcW w:type="dxa" w:w="2339"/>
+          </w:tcPr>
+          <w:p>
+            <w:r>
+              <w:t>15 тыс. руб.</w:t>
+            </w:r>
+          </w:p>
+        </w:tc>
+      </w:tr>
+      <w:tr>
+        <w:tc>
+          <w:tcPr>
+            <w:tcW w:type="dxa" w:w="2339"/>
+          </w:tcPr>
+          <w:p>
+            <w:r>
+              <w:t>2.2</w:t>
+            </w:r>
+          </w:p>
+        </w:tc>
+        <w:tc>
+          <w:tcPr>
+            <w:tcW w:type="dxa" w:w="2339"/>
+          </w:tcPr>
+          <w:p>
+            <w:r>
+              <w:t>Описание процессов «как есть» (AS-IS)</w:t>
+            </w:r>
+          </w:p>
+        </w:tc>
+        <w:tc>
+          <w:tcPr>
+            <w:tcW w:type="dxa" w:w="2339"/>
+          </w:tcPr>
+          <w:p>
+            <w:r>
+              <w:t>Бизнес-аналитик (1,0 чел.)</w:t>
+            </w:r>
+          </w:p>
+        </w:tc>
+        <w:tc>
+          <w:tcPr>
+            <w:tcW w:type="dxa" w:w="2339"/>
+          </w:tcPr>
+          <w:p>
+            <w:r>
+              <w:t>8 тыс. руб.</w:t>
+            </w:r>
+          </w:p>
+        </w:tc>
+      </w:tr>
+      <w:tr>
+        <w:tc>
+          <w:tcPr>
+            <w:tcW w:type="dxa" w:w="2339"/>
+          </w:tcPr>
+          <w:p>
+            <w:r>
+              <w:t>2.3</w:t>
+            </w:r>
+          </w:p>
+        </w:tc>
+        <w:tc>
+          <w:tcPr>
+            <w:tcW w:type="dxa" w:w="2339"/>
+          </w:tcPr>
+          <w:p>
+            <w:r>
+              <w:t>Формирование перечня функциональных и нефункциональных требований</w:t>
+            </w:r>
+          </w:p>
+        </w:tc>
+        <w:tc>
+          <w:tcPr>
+            <w:tcW w:type="dxa" w:w="2339"/>
+          </w:tcPr>
+          <w:p>
+            <w:r>
+              <w:t>Системный аналитик (1,0 чел.); Бизнес-аналитик (0,5 чел.)</w:t>
+            </w:r>
+          </w:p>
+        </w:tc>
+        <w:tc>
+          <w:tcPr>
+            <w:tcW w:type="dxa" w:w="2339"/>
+          </w:tcPr>
+          <w:p>
+            <w:r>
+              <w:t>10 тыс. руб.</w:t>
+            </w:r>
+          </w:p>
+        </w:tc>
+      </w:tr>
+      <w:tr>
+        <w:tc>
+          <w:tcPr>
+            <w:tcW w:type="dxa" w:w="2339"/>
+          </w:tcPr>
+          <w:p>
+            <w:r>
+              <w:t>3.1</w:t>
+            </w:r>
+          </w:p>
+        </w:tc>
+        <w:tc>
+          <w:tcPr>
+            <w:tcW w:type="dxa" w:w="2339"/>
+          </w:tcPr>
+          <w:p>
+            <w:r>
+              <w:t>Архитектурное проектирование (модули, роли, интеграции)</w:t>
+            </w:r>
+          </w:p>
+        </w:tc>
+        <w:tc>
+          <w:tcPr>
+            <w:tcW w:type="dxa" w:w="2339"/>
+          </w:tcPr>
+          <w:p>
+            <w:r>
+              <w:t>Системный архитектор (1,0 чел.); Системный аналитик (0,5 чел.)</w:t>
+            </w:r>
+          </w:p>
+        </w:tc>
+        <w:tc>
+          <w:tcPr>
+            <w:tcW w:type="dxa" w:w="2339"/>
+          </w:tcPr>
+          <w:p>
+            <w:r>
+              <w:t>20 тыс. руб.</w:t>
+            </w:r>
+          </w:p>
+        </w:tc>
+      </w:tr>
+      <w:tr>
+        <w:tc>
+          <w:tcPr>
+            <w:tcW w:type="dxa" w:w="2339"/>
+          </w:tcPr>
+          <w:p>
+            <w:r>
+              <w:t>3.2</w:t>
+            </w:r>
+          </w:p>
+        </w:tc>
+        <w:tc>
+          <w:tcPr>
+            <w:tcW w:type="dxa" w:w="2339"/>
+          </w:tcPr>
+          <w:p>
+            <w:r>
+              <w:t>Проектирование БД и справочников</w:t>
+            </w:r>
+          </w:p>
+        </w:tc>
+        <w:tc>
+          <w:tcPr>
+            <w:tcW w:type="dxa" w:w="2339"/>
+          </w:tcPr>
+          <w:p>
+            <w:r>
+              <w:t>Архитектор БД (1,0 чел.)</w:t>
+            </w:r>
+          </w:p>
+        </w:tc>
+        <w:tc>
+          <w:tcPr>
+            <w:tcW w:type="dxa" w:w="2339"/>
+          </w:tcPr>
+          <w:p>
+            <w:r>
+              <w:t>12 тыс. руб.</w:t>
+            </w:r>
+          </w:p>
+        </w:tc>
+      </w:tr>
+      <w:tr>
+        <w:tc>
+          <w:tcPr>
+            <w:tcW w:type="dxa" w:w="2339"/>
+          </w:tcPr>
+          <w:p>
+            <w:r>
+              <w:t>3.3</w:t>
+            </w:r>
+          </w:p>
+        </w:tc>
+        <w:tc>
+          <w:tcPr>
+            <w:tcW w:type="dxa" w:w="2339"/>
+          </w:tcPr>
+          <w:p>
+            <w:r>
+              <w:t>Проектирование интерфейсов (web/моб. кабинет заявителя и оператора)</w:t>
+            </w:r>
+          </w:p>
+        </w:tc>
+        <w:tc>
+          <w:tcPr>
+            <w:tcW w:type="dxa" w:w="2339"/>
+          </w:tcPr>
+          <w:p>
+            <w:r>
+              <w:t>UX/UI-дизайнер (1,0 чел.)</w:t>
+            </w:r>
+          </w:p>
+        </w:tc>
+        <w:tc>
+          <w:tcPr>
+            <w:tcW w:type="dxa" w:w="2339"/>
+          </w:tcPr>
+          <w:p>
+            <w:r>
+              <w:t>18 тыс. руб.</w:t>
+            </w:r>
+          </w:p>
+        </w:tc>
+      </w:tr>
+      <w:tr>
+        <w:tc>
+          <w:tcPr>
+            <w:tcW w:type="dxa" w:w="2339"/>
+          </w:tcPr>
+          <w:p>
+            <w:r>
+              <w:t>3.4</w:t>
+            </w:r>
+          </w:p>
+        </w:tc>
+        <w:tc>
+          <w:tcPr>
+            <w:tcW w:type="dxa" w:w="2339"/>
+          </w:tcPr>
+          <w:p>
+            <w:r>
+              <w:t>Подготовка технического задания</w:t>
+            </w:r>
+          </w:p>
+        </w:tc>
+        <w:tc>
+          <w:tcPr>
+            <w:tcW w:type="dxa" w:w="2339"/>
+          </w:tcPr>
+          <w:p>
+            <w:r>
+              <w:t>Системный аналитик (1,0 чел.); Руководитель проекта (0,25 чел.)</w:t>
+            </w:r>
+          </w:p>
+        </w:tc>
+        <w:tc>
+          <w:tcPr>
+            <w:tcW w:type="dxa" w:w="2339"/>
+          </w:tcPr>
+          <w:p>
+            <w:r>
+              <w:t>8 тыс. руб.</w:t>
+            </w:r>
+          </w:p>
+        </w:tc>
+      </w:tr>
+      <w:tr>
+        <w:tc>
+          <w:tcPr>
+            <w:tcW w:type="dxa" w:w="2339"/>
+          </w:tcPr>
+          <w:p>
+            <w:r>
+              <w:t>4.1</w:t>
+            </w:r>
+          </w:p>
+        </w:tc>
+        <w:tc>
+          <w:tcPr>
+            <w:tcW w:type="dxa" w:w="2339"/>
+          </w:tcPr>
+          <w:p>
+            <w:r>
+              <w:t>Модуль регистрации и маршрутизации заявок</w:t>
+            </w:r>
+          </w:p>
+        </w:tc>
+        <w:tc>
+          <w:tcPr>
+            <w:tcW w:type="dxa" w:w="2339"/>
+          </w:tcPr>
+          <w:p>
+            <w:r>
+              <w:t>Backend-разработчик (1,0 чел.); Системный аналитик (0,25 чел.)</w:t>
+            </w:r>
+          </w:p>
+        </w:tc>
+        <w:tc>
+          <w:tcPr>
+            <w:tcW w:type="dxa" w:w="2339"/>
+          </w:tcPr>
+          <w:p>
+            <w:r>
+              <w:t>35 тыс. руб.</w:t>
+            </w:r>
+          </w:p>
+        </w:tc>
+      </w:tr>
+      <w:tr>
+        <w:tc>
+          <w:tcPr>
+            <w:tcW w:type="dxa" w:w="2339"/>
+          </w:tcPr>
+          <w:p>
+            <w:r>
+              <w:t>4.2</w:t>
+            </w:r>
+          </w:p>
+        </w:tc>
+        <w:tc>
+          <w:tcPr>
+            <w:tcW w:type="dxa" w:w="2339"/>
+          </w:tcPr>
+          <w:p>
+            <w:r>
+              <w:t>Личный кабинет жителя (создание/отслеживание заявок)</w:t>
+            </w:r>
+          </w:p>
+        </w:tc>
+        <w:tc>
+          <w:tcPr>
+            <w:tcW w:type="dxa" w:w="2339"/>
+          </w:tcPr>
+          <w:p>
+            <w:r>
+              <w:t>Frontend-разработчик (1,0 чел.)</w:t>
+            </w:r>
+          </w:p>
+        </w:tc>
+        <w:tc>
+          <w:tcPr>
+            <w:tcW w:type="dxa" w:w="2339"/>
+          </w:tcPr>
+          <w:p>
+            <w:r>
+              <w:t>28 тыс. руб.</w:t>
+            </w:r>
+          </w:p>
+        </w:tc>
+      </w:tr>
+      <w:tr>
+        <w:tc>
+          <w:tcPr>
+            <w:tcW w:type="dxa" w:w="2339"/>
+          </w:tcPr>
+          <w:p>
+            <w:r>
+              <w:t>4.3</w:t>
+            </w:r>
+          </w:p>
+        </w:tc>
+        <w:tc>
+          <w:tcPr>
+            <w:tcW w:type="dxa" w:w="2339"/>
+          </w:tcPr>
+          <w:p>
+            <w:r>
+              <w:t>Кабинет диспетчера и исполнителя</w:t>
+            </w:r>
+          </w:p>
+        </w:tc>
+        <w:tc>
+          <w:tcPr>
+            <w:tcW w:type="dxa" w:w="2339"/>
+          </w:tcPr>
+          <w:p>
+            <w:r>
+              <w:t>Backend-разработчик (0,5 чел.); Frontend-разработчик (0,5 чел.)</w:t>
+            </w:r>
+          </w:p>
+        </w:tc>
+        <w:tc>
+          <w:tcPr>
+            <w:tcW w:type="dxa" w:w="2339"/>
+          </w:tcPr>
+          <w:p>
+            <w:r>
+              <w:t>30 тыс. руб.</w:t>
+            </w:r>
+          </w:p>
+        </w:tc>
+      </w:tr>
+      <w:tr>
+        <w:tc>
+          <w:tcPr>
+            <w:tcW w:type="dxa" w:w="2339"/>
+          </w:tcPr>
+          <w:p>
+            <w:r>
+              <w:t>4.4</w:t>
+            </w:r>
+          </w:p>
+        </w:tc>
+        <w:tc>
+          <w:tcPr>
+            <w:tcW w:type="dxa" w:w="2339"/>
+          </w:tcPr>
+          <w:p>
+            <w:r>
+              <w:t>Уведомления (email/SMS/push)</w:t>
+            </w:r>
+          </w:p>
+        </w:tc>
+        <w:tc>
+          <w:tcPr>
+            <w:tcW w:type="dxa" w:w="2339"/>
+          </w:tcPr>
+          <w:p>
+            <w:r>
+              <w:t>Backend-разработчик (0,5 чел.); Инженер по интеграциям (0,5 чел.)</w:t>
+            </w:r>
+          </w:p>
+        </w:tc>
+        <w:tc>
+          <w:tcPr>
+            <w:tcW w:type="dxa" w:w="2339"/>
+          </w:tcPr>
+          <w:p>
+            <w:r>
+              <w:t>25 тыс. руб.</w:t>
+            </w:r>
+          </w:p>
+        </w:tc>
+      </w:tr>
+      <w:tr>
+        <w:tc>
+          <w:tcPr>
+            <w:tcW w:type="dxa" w:w="2339"/>
+          </w:tcPr>
+          <w:p>
+            <w:r>
+              <w:t>4.5</w:t>
+            </w:r>
+          </w:p>
+        </w:tc>
+        <w:tc>
+          <w:tcPr>
+            <w:tcW w:type="dxa" w:w="2339"/>
+          </w:tcPr>
+          <w:p>
+            <w:r>
+              <w:t>Отчеты и аналитика (сроки, SLA, проблемные зоны)</w:t>
+            </w:r>
+          </w:p>
+        </w:tc>
+        <w:tc>
+          <w:tcPr>
+            <w:tcW w:type="dxa" w:w="2339"/>
+          </w:tcPr>
+          <w:p>
+            <w:r>
+              <w:t>BI-аналитик (0,5 чел.); Backend-разработчик (0,5 чел.)</w:t>
+            </w:r>
+          </w:p>
+        </w:tc>
+        <w:tc>
+          <w:tcPr>
+            <w:tcW w:type="dxa" w:w="2339"/>
+          </w:tcPr>
+          <w:p>
+            <w:r>
+              <w:t>20 тыс. руб.</w:t>
+            </w:r>
+          </w:p>
+        </w:tc>
+      </w:tr>
+      <w:tr>
+        <w:tc>
+          <w:tcPr>
+            <w:tcW w:type="dxa" w:w="2339"/>
+          </w:tcPr>
+          <w:p>
+            <w:r>
+              <w:t>5.1</w:t>
+            </w:r>
+          </w:p>
+        </w:tc>
+        <w:tc>
+          <w:tcPr>
+            <w:tcW w:type="dxa" w:w="2339"/>
+          </w:tcPr>
+          <w:p>
+            <w:r>
+              <w:t>Подготовка тест-плана и сценариев</w:t>
+            </w:r>
+          </w:p>
+        </w:tc>
+        <w:tc>
+          <w:tcPr>
+            <w:tcW w:type="dxa" w:w="2339"/>
+          </w:tcPr>
+          <w:p>
+            <w:r>
+              <w:t>Тестировщик (1,0 чел.)</w:t>
+            </w:r>
+          </w:p>
+        </w:tc>
+        <w:tc>
+          <w:tcPr>
+            <w:tcW w:type="dxa" w:w="2339"/>
+          </w:tcPr>
+          <w:p>
+            <w:r>
+              <w:t>8 тыс. руб.</w:t>
+            </w:r>
+          </w:p>
+        </w:tc>
+      </w:tr>
+      <w:tr>
+        <w:tc>
+          <w:tcPr>
+            <w:tcW w:type="dxa" w:w="2339"/>
+          </w:tcPr>
+          <w:p>
+            <w:r>
+              <w:t>5.2</w:t>
+            </w:r>
+          </w:p>
+        </w:tc>
+        <w:tc>
+          <w:tcPr>
+            <w:tcW w:type="dxa" w:w="2339"/>
+          </w:tcPr>
+          <w:p>
+            <w:r>
+              <w:t>Функциональное и интеграционное тестирование</w:t>
+            </w:r>
+          </w:p>
+        </w:tc>
+        <w:tc>
+          <w:tcPr>
+            <w:tcW w:type="dxa" w:w="2339"/>
+          </w:tcPr>
+          <w:p>
+            <w:r>
+              <w:t>Тестировщик (1,0 чел.); Системный аналитик (0,25 чел.)</w:t>
+            </w:r>
+          </w:p>
+        </w:tc>
+        <w:tc>
+          <w:tcPr>
+            <w:tcW w:type="dxa" w:w="2339"/>
+          </w:tcPr>
+          <w:p>
+            <w:r>
+              <w:t>18 тыс. руб.</w:t>
+            </w:r>
+          </w:p>
+        </w:tc>
+      </w:tr>
+      <w:tr>
+        <w:tc>
+          <w:tcPr>
+            <w:tcW w:type="dxa" w:w="2339"/>
+          </w:tcPr>
+          <w:p>
+            <w:r>
+              <w:t>5.3</w:t>
+            </w:r>
+          </w:p>
+        </w:tc>
+        <w:tc>
+          <w:tcPr>
+            <w:tcW w:type="dxa" w:w="2339"/>
+          </w:tcPr>
+          <w:p>
+            <w:r>
+              <w:t>Нагрузочное тестирование</w:t>
+            </w:r>
+          </w:p>
+        </w:tc>
+        <w:tc>
+          <w:tcPr>
+            <w:tcW w:type="dxa" w:w="2339"/>
+          </w:tcPr>
+          <w:p>
+            <w:r>
+              <w:t>Инженер по нагрузочному тестированию (0,5 чел.); DevOps-инженер (0,25 чел.)</w:t>
+            </w:r>
+          </w:p>
+        </w:tc>
+        <w:tc>
+          <w:tcPr>
+            <w:tcW w:type="dxa" w:w="2339"/>
+          </w:tcPr>
+          <w:p>
+            <w:r>
+              <w:t>16 тыс. руб.</w:t>
+            </w:r>
+          </w:p>
+        </w:tc>
+      </w:tr>
+      <w:tr>
+        <w:tc>
+          <w:tcPr>
+            <w:tcW w:type="dxa" w:w="2339"/>
+          </w:tcPr>
+          <w:p>
+            <w:r>
+              <w:t>5.4</w:t>
+            </w:r>
+          </w:p>
+        </w:tc>
+        <w:tc>
+          <w:tcPr>
+            <w:tcW w:type="dxa" w:w="2339"/>
+          </w:tcPr>
+          <w:p>
+            <w:r>
+              <w:t>Исправление дефектов и регрессионная проверка</w:t>
+            </w:r>
+          </w:p>
+        </w:tc>
+        <w:tc>
+          <w:tcPr>
+            <w:tcW w:type="dxa" w:w="2339"/>
+          </w:tcPr>
+          <w:p>
+            <w:r>
+              <w:t>Тестировщик (0,5 чел.); Разработчик (0,5 чел.)</w:t>
+            </w:r>
+          </w:p>
+        </w:tc>
+        <w:tc>
+          <w:tcPr>
+            <w:tcW w:type="dxa" w:w="2339"/>
+          </w:tcPr>
+          <w:p>
+            <w:r>
+              <w:t>12 тыс. руб.</w:t>
+            </w:r>
+          </w:p>
+        </w:tc>
+      </w:tr>
+      <w:tr>
+        <w:tc>
+          <w:tcPr>
+            <w:tcW w:type="dxa" w:w="2339"/>
+          </w:tcPr>
+          <w:p>
+            <w:r>
+              <w:t>6.1</w:t>
+            </w:r>
+          </w:p>
+        </w:tc>
+        <w:tc>
+          <w:tcPr>
+            <w:tcW w:type="dxa" w:w="2339"/>
+          </w:tcPr>
+          <w:p>
+            <w:r>
+              <w:t>Подготовка инфраструктуры и развертывание</w:t>
+            </w:r>
+          </w:p>
+        </w:tc>
+        <w:tc>
+          <w:tcPr>
+            <w:tcW w:type="dxa" w:w="2339"/>
+          </w:tcPr>
+          <w:p>
+            <w:r>
+              <w:t>DevOps-инженер (1,0 чел.)</w:t>
+            </w:r>
+          </w:p>
+        </w:tc>
+        <w:tc>
+          <w:tcPr>
+            <w:tcW w:type="dxa" w:w="2339"/>
+          </w:tcPr>
+          <w:p>
+            <w:r>
+              <w:t>32 тыс. руб.</w:t>
+            </w:r>
+          </w:p>
+        </w:tc>
+      </w:tr>
+      <w:tr>
+        <w:tc>
+          <w:tcPr>
+            <w:tcW w:type="dxa" w:w="2339"/>
+          </w:tcPr>
+          <w:p>
+            <w:r>
+              <w:t>6.2</w:t>
+            </w:r>
+          </w:p>
+        </w:tc>
+        <w:tc>
+          <w:tcPr>
+            <w:tcW w:type="dxa" w:w="2339"/>
+          </w:tcPr>
+          <w:p>
+            <w:r>
+              <w:t>Миграция начальных данных и справочников</w:t>
+            </w:r>
+          </w:p>
+        </w:tc>
+        <w:tc>
+          <w:tcPr>
+            <w:tcW w:type="dxa" w:w="2339"/>
+          </w:tcPr>
+          <w:p>
+            <w:r>
+              <w:t>Администратор БД (0,5 чел.); DevOps-инженер (0,5 чел.)</w:t>
+            </w:r>
+          </w:p>
+        </w:tc>
+        <w:tc>
+          <w:tcPr>
+            <w:tcW w:type="dxa" w:w="2339"/>
+          </w:tcPr>
+          <w:p>
+            <w:r>
+              <w:t>22 тыс. руб.</w:t>
+            </w:r>
+          </w:p>
+        </w:tc>
+      </w:tr>
+      <w:tr>
+        <w:tc>
+          <w:tcPr>
+            <w:tcW w:type="dxa" w:w="2339"/>
+          </w:tcPr>
+          <w:p>
+            <w:r>
+              <w:t>6.3</w:t>
+            </w:r>
+          </w:p>
+        </w:tc>
+        <w:tc>
+          <w:tcPr>
+            <w:tcW w:type="dxa" w:w="2339"/>
+          </w:tcPr>
+          <w:p>
+            <w:r>
+              <w:t>Обучение пользователей (диспетчеры, исполнители, администраторы)</w:t>
+            </w:r>
+          </w:p>
+        </w:tc>
+        <w:tc>
+          <w:tcPr>
+            <w:tcW w:type="dxa" w:w="2339"/>
+          </w:tcPr>
+          <w:p>
+            <w:r>
+              <w:t>Руководитель проекта (0,25 чел.); Бизнес-аналитик (0,5 чел.)</w:t>
+            </w:r>
+          </w:p>
+        </w:tc>
+        <w:tc>
+          <w:tcPr>
+            <w:tcW w:type="dxa" w:w="2339"/>
+          </w:tcPr>
+          <w:p>
+            <w:r>
+              <w:t>14 тыс. руб.</w:t>
+            </w:r>
+          </w:p>
+        </w:tc>
+      </w:tr>
+      <w:tr>
+        <w:tc>
+          <w:tcPr>
+            <w:tcW w:type="dxa" w:w="2339"/>
+          </w:tcPr>
+          <w:p>
+            <w:r>
+              <w:t>6.4</w:t>
+            </w:r>
+          </w:p>
+        </w:tc>
+        <w:tc>
+          <w:tcPr>
+            <w:tcW w:type="dxa" w:w="2339"/>
+          </w:tcPr>
+          <w:p>
+            <w:r>
+              <w:t>Пилотная эксплуатация и корректировки</w:t>
+            </w:r>
+          </w:p>
+        </w:tc>
+        <w:tc>
+          <w:tcPr>
+            <w:tcW w:type="dxa" w:w="2339"/>
+          </w:tcPr>
+          <w:p>
+            <w:r>
+              <w:t>Руководитель проекта (0,5 чел.); Специалист поддержки (0,5 чел.); Разработчик (0,25 чел.)</w:t>
+            </w:r>
+          </w:p>
+        </w:tc>
+        <w:tc>
+          <w:tcPr>
+            <w:tcW w:type="dxa" w:w="2339"/>
+          </w:tcPr>
+          <w:p>
+            <w:r>
+              <w:t>24 тыс. руб.</w:t>
+            </w:r>
+          </w:p>
+        </w:tc>
+      </w:tr>
+      <w:tr>
+        <w:tc>
+          <w:tcPr>
+            <w:tcW w:type="dxa" w:w="2339"/>
+          </w:tcPr>
+          <w:p>
+            <w:r>
+              <w:t>7.1</w:t>
+            </w:r>
+          </w:p>
+        </w:tc>
+        <w:tc>
+          <w:tcPr>
+            <w:tcW w:type="dxa" w:w="2339"/>
+          </w:tcPr>
+          <w:p>
+            <w:r>
+              <w:t>Приемо-сдаточные испытания</w:t>
+            </w:r>
+          </w:p>
+        </w:tc>
+        <w:tc>
+          <w:tcPr>
+            <w:tcW w:type="dxa" w:w="2339"/>
+          </w:tcPr>
+          <w:p>
+            <w:r>
+              <w:t>Представитель заказчика (0,25 чел.); Руководитель проекта (0,25 чел.); Тестировщик (0,25 чел.)</w:t>
+            </w:r>
+          </w:p>
+        </w:tc>
+        <w:tc>
+          <w:tcPr>
+            <w:tcW w:type="dxa" w:w="2339"/>
+          </w:tcPr>
+          <w:p>
+            <w:r>
+              <w:t>8 тыс. руб.</w:t>
+            </w:r>
+          </w:p>
+        </w:tc>
+      </w:tr>
+      <w:tr>
+        <w:tc>
+          <w:tcPr>
+            <w:tcW w:type="dxa" w:w="2339"/>
+          </w:tcPr>
+          <w:p>
+            <w:r>
+              <w:t>7.2</w:t>
+            </w:r>
+          </w:p>
+        </w:tc>
+        <w:tc>
+          <w:tcPr>
+            <w:tcW w:type="dxa" w:w="2339"/>
+          </w:tcPr>
+          <w:p>
+            <w:r>
+              <w:t>Ввод в промышленную эксплуатацию</w:t>
+            </w:r>
+          </w:p>
+        </w:tc>
+        <w:tc>
+          <w:tcPr>
+            <w:tcW w:type="dxa" w:w="2339"/>
+          </w:tcPr>
+          <w:p>
+            <w:r>
+              <w:t>DevOps-инженер (0,5 чел.); Руководитель проекта (0,25 чел.)</w:t>
+            </w:r>
+          </w:p>
+        </w:tc>
+        <w:tc>
+          <w:tcPr>
+            <w:tcW w:type="dxa" w:w="2339"/>
+          </w:tcPr>
+          <w:p>
+            <w:r>
+              <w:t>10 тыс. руб.</w:t>
+            </w:r>
+          </w:p>
+        </w:tc>
+      </w:tr>
+      <w:tr>
+        <w:tc>
+          <w:tcPr>
+            <w:tcW w:type="dxa" w:w="2339"/>
+          </w:tcPr>
+          <w:p>
+            <w:r>
+              <w:t>7.3</w:t>
+            </w:r>
+          </w:p>
+        </w:tc>
+        <w:tc>
+          <w:tcPr>
+            <w:tcW w:type="dxa" w:w="2339"/>
+          </w:tcPr>
+          <w:p>
+            <w:r>
+              <w:t>Закрытие проекта и передача в сопровождение</w:t>
+            </w:r>
+          </w:p>
+        </w:tc>
+        <w:tc>
+          <w:tcPr>
+            <w:tcW w:type="dxa" w:w="2339"/>
+          </w:tcPr>
+          <w:p>
+            <w:r>
+              <w:t>Руководитель проекта (0,25 чел.); Специалист сопровождения (0,25 чел.)</w:t>
+            </w:r>
+          </w:p>
+        </w:tc>
+        <w:tc>
+          <w:tcPr>
+            <w:tcW w:type="dxa" w:w="2339"/>
+          </w:tcPr>
+          <w:p>
+            <w:r>
+              <w:t>8 тыс. руб.</w:t>
+            </w:r>
+          </w:p>
+        </w:tc>
+      </w:tr>
+    </w:tbl>
+    <w:p/>
+    <w:p>
+      <w:r>
+        <w:drawing>
+          <wp:inline xmlns:a="http://schemas.openxmlformats.org/drawingml/2006/main" xmlns:pic="http://schemas.openxmlformats.org/drawingml/2006/picture">
+            <wp:extent cx="6400800" cy="3174767"/>
+            <wp:docPr id="3" name="Picture 3"/>
+            <wp:cNvGraphicFramePr>
+              <a:graphicFrameLocks noChangeAspect="1"/>
+            </wp:cNvGraphicFramePr>
+            <a:graphic>
+              <a:graphicData uri="http://schemas.openxmlformats.org/drawingml/2006/picture">
+                <pic:pic>
+                  <pic:nvPicPr>
+                    <pic:cNvPr id="0" name="image.png"/>
+                    <pic:cNvPicPr/>
+                  </pic:nvPicPr>
+                  <pic:blipFill>
+                    <a:blip r:embed="rId10"/>
+                    <a:stretch>
+                      <a:fillRect/>
+                    </a:stretch>
+                  </pic:blipFill>
+                  <pic:spPr>
+                    <a:xfrm>
+                      <a:off x="0" y="0"/>
+                      <a:ext cx="6400800" cy="3174767"/>
+                    </a:xfrm>
+                    <a:prstGeom prst="rect"/>
+                  </pic:spPr>
+                </pic:pic>
+              </a:graphicData>
+            </a:graphic>
+          </wp:inline>
+        </w:drawing>
+      </w:r>
+    </w:p>
+    <w:p>
+      <w:pPr>
+        <w:jc w:val="center"/>
+      </w:pPr>
+      <w:r>
+        <w:rPr>
+          <w:b/>
+        </w:rPr>
+        <w:t>Рисунок 3 - Гистограмма загрузки ресурсов</w:t>
+      </w:r>
+    </w:p>
     <w:sectPr>
       <w:pgSz w:w="11906" w:h="16838"/>
       <w:pgMar w:top="1134" w:right="850" w:bottom="1134" w:left="1701" w:header="708" w:footer="708" w:gutter="0"/>

</xml_diff>